<commit_message>
docs/venta: flujo operativo v2.1 (rastreo de guardias/supervisores + resumen GPS)
Capítulo consolidado de rastreo (GPS en vivo, estatus, rondín QR/NFC + geocerca, recorrido, monitoreo, supervisión) y resumen de cómo funciona el rastreo GPS (cadencia, dónde queda el registro, parámetros).

Co-Authored-By: Claude Opus 4.8 <noreply@anthropic.com>
</commit_message>
<xml_diff>
--- a/docs/venta/SGS-Flujo-Operativo.docx
+++ b/docs/venta/SGS-Flujo-Operativo.docx
@@ -114,7 +114,7 @@
           <w:sz w:val="20"/>
           <w:szCs w:val="20"/>
         </w:rPr>
-        <w:t xml:space="preserve">Versión 2.0 · Agosto 2026</w:t>
+        <w:t xml:space="preserve">Versión 2.1 · Agosto 2026</w:t>
       </w:r>
     </w:p>
     <w:p>
@@ -1247,7 +1247,7 @@
           <w:sz w:val="21"/>
           <w:szCs w:val="21"/>
         </w:rPr>
-        <w:t xml:space="preserve">ver en un mapa, en tiempo real, dónde está cada guardia y cada sitio.</w:t>
+        <w:t xml:space="preserve">ver en un mapa, en tiempo real, la operación completa. Cada tipo tiene su color y su puntero:</w:t>
       </w:r>
     </w:p>
     <w:p>
@@ -1261,11 +1261,75 @@
       </w:pPr>
       <w:r>
         <w:rPr>
-          <w:color w:val="222222"/>
-          <w:sz w:val="21"/>
-          <w:szCs w:val="21"/>
-        </w:rPr>
-        <w:t xml:space="preserve">Muestra los sitios/puestos como pines y los guardias con la app como puntos azules en vivo (posición reportada por el teléfono cada N segundos).</w:t>
+          <w:b/>
+          <w:bCs/>
+          <w:color w:val="222222"/>
+          <w:sz w:val="21"/>
+          <w:szCs w:val="21"/>
+        </w:rPr>
+        <w:t xml:space="preserve">Sitios / puestos </w:t>
+      </w:r>
+      <w:r>
+        <w:rPr>
+          <w:color w:val="222222"/>
+          <w:sz w:val="21"/>
+          <w:szCs w:val="21"/>
+        </w:rPr>
+        <w:t xml:space="preserve">(pin naranja), </w:t>
+      </w:r>
+      <w:r>
+        <w:rPr>
+          <w:b/>
+          <w:bCs/>
+          <w:color w:val="222222"/>
+          <w:sz w:val="21"/>
+          <w:szCs w:val="21"/>
+        </w:rPr>
+        <w:t xml:space="preserve">puntos de control </w:t>
+      </w:r>
+      <w:r>
+        <w:rPr>
+          <w:color w:val="222222"/>
+          <w:sz w:val="21"/>
+          <w:szCs w:val="21"/>
+        </w:rPr>
+        <w:t xml:space="preserve">(rombo teal), </w:t>
+      </w:r>
+      <w:r>
+        <w:rPr>
+          <w:b/>
+          <w:bCs/>
+          <w:color w:val="222222"/>
+          <w:sz w:val="21"/>
+          <w:szCs w:val="21"/>
+        </w:rPr>
+        <w:t xml:space="preserve">guardias con la app </w:t>
+      </w:r>
+      <w:r>
+        <w:rPr>
+          <w:color w:val="222222"/>
+          <w:sz w:val="21"/>
+          <w:szCs w:val="21"/>
+        </w:rPr>
+        <w:t xml:space="preserve">(punto azul en vivo) e </w:t>
+      </w:r>
+      <w:r>
+        <w:rPr>
+          <w:b/>
+          <w:bCs/>
+          <w:color w:val="222222"/>
+          <w:sz w:val="21"/>
+          <w:szCs w:val="21"/>
+        </w:rPr>
+        <w:t xml:space="preserve">incidencias/alertas abiertas </w:t>
+      </w:r>
+      <w:r>
+        <w:rPr>
+          <w:color w:val="222222"/>
+          <w:sz w:val="21"/>
+          <w:szCs w:val="21"/>
+        </w:rPr>
+        <w:t xml:space="preserve">(triángulo rojo).</w:t>
       </w:r>
     </w:p>
     <w:p>
@@ -1283,7 +1347,7 @@
           <w:sz w:val="21"/>
           <w:szCs w:val="21"/>
         </w:rPr>
-        <w:t xml:space="preserve">El intervalo de reporte y la ventana de “en línea” se configuran en Parámetros del sistema.</w:t>
+        <w:t xml:space="preserve">Al hacer clic en un guardia, su globo muestra su estatus actual: En posición, En rondín o En pausa (con motivo). En un incidente muestra su estado (recibida/despachado/en atención); los cerrados ya no aparecen en el mapa.</w:t>
       </w:r>
     </w:p>
     <w:p>
@@ -1301,7 +1365,25 @@
           <w:sz w:val="21"/>
           <w:szCs w:val="21"/>
         </w:rPr>
-        <w:t xml:space="preserve">La ubicación de los guardias solo la ven mandos (supervisor/administrador); a otros roles la capa llega vacía.</w:t>
+        <w:t xml:space="preserve">Refresco automático cada minuto que actualiza los marcadores SIN mover ni reencuadrar el mapa: el operador conserva el foco/zoom donde estaba.</w:t>
+      </w:r>
+    </w:p>
+    <w:p>
+      <w:pPr>
+        <w:pStyle w:val="ListParagraph"/>
+        <w:numPr>
+          <w:ilvl w:val="0"/>
+          <w:numId w:val="2"/>
+        </w:numPr>
+        <w:spacing w:after="60" w:line="268"/>
+      </w:pPr>
+      <w:r>
+        <w:rPr>
+          <w:color w:val="222222"/>
+          <w:sz w:val="21"/>
+          <w:szCs w:val="21"/>
+        </w:rPr>
+        <w:t xml:space="preserve">El intervalo de reporte GPS y la ventana de “en línea” se configuran en Parámetros del sistema. La ubicación de los guardias solo la ven mandos (supervisor/administrador).</w:t>
       </w:r>
     </w:p>
     <w:p>
@@ -1476,7 +1558,7 @@
           <w:bCs/>
           <w:color w:val="1F3A5F"/>
         </w:rPr>
-        <w:t xml:space="preserve">4.5 Rondines</w:t>
+        <w:t xml:space="preserve">4.5 Rondines (verificados con QR/NFC y geocerca)</w:t>
       </w:r>
     </w:p>
     <w:p>
@@ -1499,7 +1581,7 @@
           <w:sz w:val="21"/>
           <w:szCs w:val="21"/>
         </w:rPr>
-        <w:t xml:space="preserve">la evidencia de que el guardia recorrió los puntos de control.</w:t>
+        <w:t xml:space="preserve">la evidencia de que el guardia recorrió realmente los puntos de control.</w:t>
       </w:r>
     </w:p>
     <w:p>
@@ -1517,7 +1599,7 @@
           <w:sz w:val="21"/>
           <w:szCs w:val="21"/>
         </w:rPr>
-        <w:t xml:space="preserve">Cada paso proviene del campo: al escanear el QR, el móvil crea el rondín con guardia, hora, GPS y novedad.</w:t>
+        <w:t xml:space="preserve">Cada paso proviene del campo: el guardia lee el punto por QR o por etiqueta NFC; el móvil registra guardia, hora, GPS y novedad.</w:t>
       </w:r>
     </w:p>
     <w:p>
@@ -1531,11 +1613,57 @@
       </w:pPr>
       <w:r>
         <w:rPr>
-          <w:color w:val="222222"/>
-          <w:sz w:val="21"/>
-          <w:szCs w:val="21"/>
-        </w:rPr>
-        <w:t xml:space="preserve">La central visualiza los rondines por sitio, punto, guardia y fecha, resaltando los que traen novedad.</w:t>
+          <w:b/>
+          <w:bCs/>
+          <w:color w:val="222222"/>
+          <w:sz w:val="21"/>
+          <w:szCs w:val="21"/>
+        </w:rPr>
+        <w:t xml:space="preserve">Validación de lugar (geocerca): </w:t>
+      </w:r>
+      <w:r>
+        <w:rPr>
+          <w:color w:val="222222"/>
+          <w:sz w:val="21"/>
+          <w:szCs w:val="21"/>
+        </w:rPr>
+        <w:t xml:space="preserve">el sistema calcula la distancia entre el guardia y la etiqueta y verifica que esté dentro del radio del punto más un margen de tolerancia por GPS. Si está fuera, el paso se registra pero queda marcado como “fuera de rango”.</w:t>
+      </w:r>
+    </w:p>
+    <w:p>
+      <w:pPr>
+        <w:pStyle w:val="ListParagraph"/>
+        <w:numPr>
+          <w:ilvl w:val="0"/>
+          <w:numId w:val="2"/>
+        </w:numPr>
+        <w:spacing w:after="60" w:line="268"/>
+      </w:pPr>
+      <w:r>
+        <w:rPr>
+          <w:color w:val="222222"/>
+          <w:sz w:val="21"/>
+          <w:szCs w:val="21"/>
+        </w:rPr>
+        <w:t xml:space="preserve">Cada lectura guarda además el método (QR/NFC), el tipo de evento (entrada/salida/control) y la distancia a la etiqueta.</w:t>
+      </w:r>
+    </w:p>
+    <w:p>
+      <w:pPr>
+        <w:pStyle w:val="ListParagraph"/>
+        <w:numPr>
+          <w:ilvl w:val="0"/>
+          <w:numId w:val="2"/>
+        </w:numPr>
+        <w:spacing w:after="60" w:line="268"/>
+      </w:pPr>
+      <w:r>
+        <w:rPr>
+          <w:color w:val="222222"/>
+          <w:sz w:val="21"/>
+          <w:szCs w:val="21"/>
+        </w:rPr>
+        <w:t xml:space="preserve">La central ve los rondines por sitio, punto, guardia y fecha, resaltando los que traen novedad o quedaron fuera de rango. Cada lectura tiene su ficha de detalle.</w:t>
       </w:r>
     </w:p>
     <w:p>
@@ -1572,7 +1700,7 @@
           <w:sz w:val="21"/>
           <w:szCs w:val="21"/>
         </w:rPr>
-        <w:t xml:space="preserve">revisar a detalle el recorrido de un guardia en una fecha.</w:t>
+        <w:t xml:space="preserve">revisar a detalle el trabajo realizado, por fecha, cliente, sitio y guardia.</w:t>
       </w:r>
     </w:p>
     <w:p>
@@ -1590,7 +1718,7 @@
           <w:sz w:val="21"/>
           <w:szCs w:val="21"/>
         </w:rPr>
-        <w:t xml:space="preserve">Se elige un guardia y una fecha; se muestra en un mapa el trayecto GPS (línea) y el punto de lectura de cada QR (marcadores, rojo si hubo novedad).</w:t>
+        <w:t xml:space="preserve">Filtros en cascada fijos en pantalla: fecha (calendario) → cliente → sitio → guardia (opcional). Se pueden cambiar en cualquier momento; los resultados se desplazan con scroll debajo.</w:t>
       </w:r>
     </w:p>
     <w:p>
@@ -1608,7 +1736,7 @@
           <w:sz w:val="21"/>
           <w:szCs w:val="21"/>
         </w:rPr>
-        <w:t xml:space="preserve">Debajo, un historial en línea de tiempo con cada punto, su fecha/hora y las novedades (mismo estilo que el historial de atención de un despacho).</w:t>
+        <w:t xml:space="preserve">Mapa con el trayecto GPS (línea) y el punto de lectura de cada QR/NFC (marcadores por guardia; rojo si hubo novedad o quedó fuera de rango). Al hacer clic en un punto se abre su registro.</w:t>
       </w:r>
     </w:p>
     <w:p>
@@ -1626,7 +1754,25 @@
           <w:sz w:val="21"/>
           <w:szCs w:val="21"/>
         </w:rPr>
-        <w:t xml:space="preserve">Se puede exportar a PDF (encabezado, resumen, mapa y tabla) para archivo o entrega al cliente.</w:t>
+        <w:t xml:space="preserve">Historial del recorrido agrupado por sitio y por guardia, colapsable: al abrir un guardia se ve su línea de tiempo (punto, fecha/hora, método y novedades).</w:t>
+      </w:r>
+    </w:p>
+    <w:p>
+      <w:pPr>
+        <w:pStyle w:val="ListParagraph"/>
+        <w:numPr>
+          <w:ilvl w:val="0"/>
+          <w:numId w:val="2"/>
+        </w:numPr>
+        <w:spacing w:after="60" w:line="268"/>
+      </w:pPr>
+      <w:r>
+        <w:rPr>
+          <w:color w:val="222222"/>
+          <w:sz w:val="21"/>
+          <w:szCs w:val="21"/>
+        </w:rPr>
+        <w:t xml:space="preserve">Exportación a PDF por guardia (con su trayecto) o por sitio (todos los guardias, agrupados) para archivo o entrega al cliente.</w:t>
       </w:r>
     </w:p>
     <w:p>
@@ -2385,7 +2531,7 @@
           <w:sz w:val="21"/>
           <w:szCs w:val="21"/>
         </w:rPr>
-        <w:t xml:space="preserve">Con la identidad fijada, cada rondín, incidente, evidencia, tarea o alerta queda atribuido al guardia correcto, y comienza a compartirse su ubicación GPS.</w:t>
+        <w:t xml:space="preserve">Con la identidad fijada, cada rondín, incidente, evidencia, tarea o alerta queda atribuido al guardia correcto; comienza a compartirse su ubicación GPS y se activan las geocercas de los sitios (entrada/salida automáticas).</w:t>
       </w:r>
     </w:p>
     <w:p>
@@ -2399,7 +2545,7 @@
           <w:bCs/>
           <w:color w:val="1F3A5F"/>
         </w:rPr>
-        <w:t xml:space="preserve">5.2 Inicio</w:t>
+        <w:t xml:space="preserve">5.2 Inicio y estatus del guardia</w:t>
       </w:r>
     </w:p>
     <w:p>
@@ -2413,6 +2559,29 @@
           <w:szCs w:val="21"/>
         </w:rPr>
         <w:t xml:space="preserve">Encabezado con logo, “SGS Móvil”, el turno y el estado en línea. Accesos rápidos: Registrar rondín, Levantar incidente, Nueva evidencia, Mis tareas, Descargar bodycam y Crear un recordatorio. Un botón rojo destacado: ENVIAR ALERTA.</w:t>
+      </w:r>
+    </w:p>
+    <w:p>
+      <w:pPr>
+        <w:spacing w:after="120" w:line="276"/>
+      </w:pPr>
+      <w:r>
+        <w:rPr>
+          <w:b/>
+          <w:bCs/>
+          <w:color w:val="222222"/>
+          <w:sz w:val="21"/>
+          <w:szCs w:val="21"/>
+        </w:rPr>
+        <w:t xml:space="preserve">Mi estado: </w:t>
+      </w:r>
+      <w:r>
+        <w:rPr>
+          <w:color w:val="222222"/>
+          <w:sz w:val="21"/>
+          <w:szCs w:val="21"/>
+        </w:rPr>
+        <w:t xml:space="preserve">el guardia marca su estatus de servicio —En posición, En rondín o En pausa (alimentos, baño, descanso…)—; queda visible para la central en el monitoreo en vivo.</w:t>
       </w:r>
     </w:p>
     <w:p>
@@ -2426,7 +2595,7 @@
           <w:bCs/>
           <w:color w:val="1F3A5F"/>
         </w:rPr>
-        <w:t xml:space="preserve">5.3 Rondín por escaneo de QR</w:t>
+        <w:t xml:space="preserve">5.3 Rondín por QR o NFC (con validación de lugar)</w:t>
       </w:r>
     </w:p>
     <w:p>
@@ -2449,7 +2618,7 @@
           <w:sz w:val="21"/>
           <w:szCs w:val="21"/>
         </w:rPr>
-        <w:t xml:space="preserve">dejar constancia del paso por un punto de control y cerrar el ciclo del rondín.</w:t>
+        <w:t xml:space="preserve">dejar constancia verificada del paso por un punto y cerrar el ciclo del rondín.</w:t>
       </w:r>
     </w:p>
     <w:p>
@@ -2467,7 +2636,7 @@
           <w:sz w:val="21"/>
           <w:szCs w:val="21"/>
         </w:rPr>
-        <w:t xml:space="preserve">El guardia abre Rondín; la cámara escanea el QR del punto (o teclea el código).</w:t>
+        <w:t xml:space="preserve">El guardia abre Rondín y lee el punto: escanea el QR con la cámara, acerca la etiqueta NFC, o teclea el código.</w:t>
       </w:r>
     </w:p>
     <w:p>
@@ -2503,7 +2672,25 @@
           <w:sz w:val="21"/>
           <w:szCs w:val="21"/>
         </w:rPr>
-        <w:t xml:space="preserve">Al registrar, el paso se envía al sistema con hora y GPS; la central lo ve al instante en Rondines y Supervisión.</w:t>
+        <w:t xml:space="preserve">Al registrar, se envía con hora y GPS. El sistema valida la distancia a la etiqueta: si está fuera del rango permitido, avisa al guardia (“fuera de rango, acércate al punto”) y el paso queda marcado como fuera de rango.</w:t>
+      </w:r>
+    </w:p>
+    <w:p>
+      <w:pPr>
+        <w:pStyle w:val="ListParagraph"/>
+        <w:numPr>
+          <w:ilvl w:val="0"/>
+          <w:numId w:val="6"/>
+        </w:numPr>
+        <w:spacing w:after="70" w:line="268"/>
+      </w:pPr>
+      <w:r>
+        <w:rPr>
+          <w:color w:val="222222"/>
+          <w:sz w:val="21"/>
+          <w:szCs w:val="21"/>
+        </w:rPr>
+        <w:t xml:space="preserve">La central lo ve al instante en Rondines, Monitoreo y Supervisión, con método, distancia y estado dentro/fuera de rango.</w:t>
       </w:r>
     </w:p>
     <w:p>
@@ -3046,6 +3233,11 @@
       </w:r>
     </w:p>
     <w:p>
+      <w:r>
+        <w:br w:type="page"/>
+      </w:r>
+    </w:p>
+    <w:p>
       <w:pPr>
         <w:pStyle w:val="Heading1"/>
         <w:spacing w:after="160" w:before="320"/>
@@ -3056,7 +3248,1016 @@
           <w:bCs/>
           <w:color w:val="1F3A5F"/>
         </w:rPr>
-        <w:t xml:space="preserve">7. Principios que el usuario debe conocer</w:t>
+        <w:t xml:space="preserve">7. Rastreo y supervisión del trabajo del personal</w:t>
+      </w:r>
+    </w:p>
+    <w:p>
+      <w:pPr>
+        <w:spacing w:after="120" w:line="276"/>
+      </w:pPr>
+      <w:r>
+        <w:rPr>
+          <w:color w:val="222222"/>
+          <w:sz w:val="21"/>
+          <w:szCs w:val="21"/>
+        </w:rPr>
+        <w:t xml:space="preserve">SGS rastrea el trabajo de guardias y supervisores en tres planos: DÓNDE están (GPS), QUÉ están haciendo (estatus y rondines verificados) y QUÉ ocurrió (historial y reportes). Todo lo anterior converge aquí.</w:t>
+      </w:r>
+    </w:p>
+    <w:p>
+      <w:pPr>
+        <w:pStyle w:val="Heading2"/>
+        <w:spacing w:after="100" w:before="240"/>
+      </w:pPr>
+      <w:r>
+        <w:rPr>
+          <w:b/>
+          <w:bCs/>
+          <w:color w:val="1F3A5F"/>
+        </w:rPr>
+        <w:t xml:space="preserve">7.1 Identidad y estatus del guardia</w:t>
+      </w:r>
+    </w:p>
+    <w:p>
+      <w:pPr>
+        <w:pStyle w:val="ListParagraph"/>
+        <w:numPr>
+          <w:ilvl w:val="0"/>
+          <w:numId w:val="2"/>
+        </w:numPr>
+        <w:spacing w:after="60" w:line="268"/>
+      </w:pPr>
+      <w:r>
+        <w:rPr>
+          <w:color w:val="222222"/>
+          <w:sz w:val="21"/>
+          <w:szCs w:val="21"/>
+        </w:rPr>
+        <w:t xml:space="preserve">El guardia se identifica una vez (“Mi elemento”, validado contra su smartphone-bodycam); desde entonces todo queda atribuido a él.</w:t>
+      </w:r>
+    </w:p>
+    <w:p>
+      <w:pPr>
+        <w:pStyle w:val="ListParagraph"/>
+        <w:numPr>
+          <w:ilvl w:val="0"/>
+          <w:numId w:val="2"/>
+        </w:numPr>
+        <w:spacing w:after="60" w:line="268"/>
+      </w:pPr>
+      <w:r>
+        <w:rPr>
+          <w:b/>
+          <w:bCs/>
+          <w:color w:val="222222"/>
+          <w:sz w:val="21"/>
+          <w:szCs w:val="21"/>
+        </w:rPr>
+        <w:t xml:space="preserve">Estatus de servicio </w:t>
+      </w:r>
+      <w:r>
+        <w:rPr>
+          <w:color w:val="222222"/>
+          <w:sz w:val="21"/>
+          <w:szCs w:val="21"/>
+        </w:rPr>
+        <w:t xml:space="preserve">que él mismo marca: En posición · En rondín · En pausa (con motivo). La central lo ve en vivo.</w:t>
+      </w:r>
+    </w:p>
+    <w:p>
+      <w:pPr>
+        <w:pStyle w:val="Heading2"/>
+        <w:spacing w:after="100" w:before="240"/>
+      </w:pPr>
+      <w:r>
+        <w:rPr>
+          <w:b/>
+          <w:bCs/>
+          <w:color w:val="1F3A5F"/>
+        </w:rPr>
+        <w:t xml:space="preserve">7.2 Ubicación GPS en vivo</w:t>
+      </w:r>
+    </w:p>
+    <w:p>
+      <w:pPr>
+        <w:pStyle w:val="ListParagraph"/>
+        <w:numPr>
+          <w:ilvl w:val="0"/>
+          <w:numId w:val="2"/>
+        </w:numPr>
+        <w:spacing w:after="60" w:line="268"/>
+      </w:pPr>
+      <w:r>
+        <w:rPr>
+          <w:color w:val="222222"/>
+          <w:sz w:val="21"/>
+          <w:szCs w:val="21"/>
+        </w:rPr>
+        <w:t xml:space="preserve">El teléfono reporta su posición cada N segundos (configurable) mientras hay turno; la central ve a cada guardia moverse en el mapa.</w:t>
+      </w:r>
+    </w:p>
+    <w:p>
+      <w:pPr>
+        <w:pStyle w:val="ListParagraph"/>
+        <w:numPr>
+          <w:ilvl w:val="0"/>
+          <w:numId w:val="2"/>
+        </w:numPr>
+        <w:spacing w:after="60" w:line="268"/>
+      </w:pPr>
+      <w:r>
+        <w:rPr>
+          <w:color w:val="222222"/>
+          <w:sz w:val="21"/>
+          <w:szCs w:val="21"/>
+        </w:rPr>
+        <w:t xml:space="preserve">Un guardia se considera “en línea” si reportó dentro de la ventana configurada. La ubicación solo la ven mandos.</w:t>
+      </w:r>
+    </w:p>
+    <w:p>
+      <w:pPr>
+        <w:pStyle w:val="Heading2"/>
+        <w:spacing w:after="100" w:before="240"/>
+      </w:pPr>
+      <w:r>
+        <w:rPr>
+          <w:b/>
+          <w:bCs/>
+          <w:color w:val="1F3A5F"/>
+        </w:rPr>
+        <w:t xml:space="preserve">7.3 Rondín verificado (QR / NFC + geocerca)</w:t>
+      </w:r>
+    </w:p>
+    <w:p>
+      <w:pPr>
+        <w:pStyle w:val="ListParagraph"/>
+        <w:numPr>
+          <w:ilvl w:val="0"/>
+          <w:numId w:val="2"/>
+        </w:numPr>
+        <w:spacing w:after="60" w:line="268"/>
+      </w:pPr>
+      <w:r>
+        <w:rPr>
+          <w:color w:val="222222"/>
+          <w:sz w:val="21"/>
+          <w:szCs w:val="21"/>
+        </w:rPr>
+        <w:t xml:space="preserve">El guardia lee cada punto por QR o NFC. Se registra hora, GPS, método, tipo de evento (entrada/salida/control) y la distancia a la etiqueta.</w:t>
+      </w:r>
+    </w:p>
+    <w:p>
+      <w:pPr>
+        <w:pStyle w:val="ListParagraph"/>
+        <w:numPr>
+          <w:ilvl w:val="0"/>
+          <w:numId w:val="2"/>
+        </w:numPr>
+        <w:spacing w:after="60" w:line="268"/>
+      </w:pPr>
+      <w:r>
+        <w:rPr>
+          <w:color w:val="222222"/>
+          <w:sz w:val="21"/>
+          <w:szCs w:val="21"/>
+        </w:rPr>
+        <w:t xml:space="preserve">La geocerca valida que esté físicamente en el punto (radio + margen por error de GPS). Fuera de rango → se registra marcado y se avisa al guardia. Es el control anti-fraude clave.</w:t>
+      </w:r>
+    </w:p>
+    <w:p>
+      <w:pPr>
+        <w:pStyle w:val="Heading2"/>
+        <w:spacing w:after="100" w:before="240"/>
+      </w:pPr>
+      <w:r>
+        <w:rPr>
+          <w:b/>
+          <w:bCs/>
+          <w:color w:val="1F3A5F"/>
+        </w:rPr>
+        <w:t xml:space="preserve">7.4 Geocercas de sitio (entrada/salida automática)</w:t>
+      </w:r>
+    </w:p>
+    <w:p>
+      <w:pPr>
+        <w:pStyle w:val="ListParagraph"/>
+        <w:numPr>
+          <w:ilvl w:val="0"/>
+          <w:numId w:val="2"/>
+        </w:numPr>
+        <w:spacing w:after="60" w:line="268"/>
+      </w:pPr>
+      <w:r>
+        <w:rPr>
+          <w:color w:val="222222"/>
+          <w:sz w:val="21"/>
+          <w:szCs w:val="21"/>
+        </w:rPr>
+        <w:t xml:space="preserve">En segundo plano, el móvil detecta cuándo el guardia entra o sale del perímetro de un sitio y lo registra automáticamente (llegada/abandono del lugar).</w:t>
+      </w:r>
+    </w:p>
+    <w:p>
+      <w:pPr>
+        <w:pStyle w:val="Heading2"/>
+        <w:spacing w:after="100" w:before="240"/>
+      </w:pPr>
+      <w:r>
+        <w:rPr>
+          <w:b/>
+          <w:bCs/>
+          <w:color w:val="1F3A5F"/>
+        </w:rPr>
+        <w:t xml:space="preserve">7.5 Recorrido histórico</w:t>
+      </w:r>
+    </w:p>
+    <w:p>
+      <w:pPr>
+        <w:pStyle w:val="ListParagraph"/>
+        <w:numPr>
+          <w:ilvl w:val="0"/>
+          <w:numId w:val="2"/>
+        </w:numPr>
+        <w:spacing w:after="60" w:line="268"/>
+      </w:pPr>
+      <w:r>
+        <w:rPr>
+          <w:color w:val="222222"/>
+          <w:sz w:val="21"/>
+          <w:szCs w:val="21"/>
+        </w:rPr>
+        <w:t xml:space="preserve">Además de la última posición, el sistema acumula el trayecto GPS del guardia, que junto con las lecturas de QR/NFC permite reconstruir su recorrido de cualquier día.</w:t>
+      </w:r>
+    </w:p>
+    <w:p>
+      <w:pPr>
+        <w:pStyle w:val="Heading2"/>
+        <w:spacing w:after="100" w:before="240"/>
+      </w:pPr>
+      <w:r>
+        <w:rPr>
+          <w:b/>
+          <w:bCs/>
+          <w:color w:val="1F3A5F"/>
+        </w:rPr>
+        <w:t xml:space="preserve">7.6 Monitoreo en vivo (central)</w:t>
+      </w:r>
+    </w:p>
+    <w:p>
+      <w:pPr>
+        <w:pStyle w:val="ListParagraph"/>
+        <w:numPr>
+          <w:ilvl w:val="0"/>
+          <w:numId w:val="2"/>
+        </w:numPr>
+        <w:spacing w:after="60" w:line="268"/>
+      </w:pPr>
+      <w:r>
+        <w:rPr>
+          <w:color w:val="222222"/>
+          <w:sz w:val="21"/>
+          <w:szCs w:val="21"/>
+        </w:rPr>
+        <w:t xml:space="preserve">Mapa con sitios, puntos de control, guardias (con su estatus) e incidencias/alertas, cada uno con color y puntero propios; refresco cada minuto sin perder el foco del operador.</w:t>
+      </w:r>
+    </w:p>
+    <w:p>
+      <w:pPr>
+        <w:pStyle w:val="Heading2"/>
+        <w:spacing w:after="100" w:before="240"/>
+      </w:pPr>
+      <w:r>
+        <w:rPr>
+          <w:b/>
+          <w:bCs/>
+          <w:color w:val="1F3A5F"/>
+        </w:rPr>
+        <w:t xml:space="preserve">7.7 Supervisión y reportes</w:t>
+      </w:r>
+    </w:p>
+    <w:p>
+      <w:pPr>
+        <w:pStyle w:val="ListParagraph"/>
+        <w:numPr>
+          <w:ilvl w:val="0"/>
+          <w:numId w:val="2"/>
+        </w:numPr>
+        <w:spacing w:after="60" w:line="268"/>
+      </w:pPr>
+      <w:r>
+        <w:rPr>
+          <w:color w:val="222222"/>
+          <w:sz w:val="21"/>
+          <w:szCs w:val="21"/>
+        </w:rPr>
+        <w:t xml:space="preserve">Revisión por fecha/cliente/sitio/guardia: trayecto y lecturas en mapa, historial agrupado por sitio y guardia, y exportación a PDF por guardia o por sitio.</w:t>
+      </w:r>
+    </w:p>
+    <w:p>
+      <w:pPr>
+        <w:pStyle w:val="ListParagraph"/>
+        <w:numPr>
+          <w:ilvl w:val="0"/>
+          <w:numId w:val="2"/>
+        </w:numPr>
+        <w:spacing w:after="60" w:line="268"/>
+      </w:pPr>
+      <w:r>
+        <w:rPr>
+          <w:color w:val="222222"/>
+          <w:sz w:val="21"/>
+          <w:szCs w:val="21"/>
+        </w:rPr>
+        <w:t xml:space="preserve">Cada lectura tiene su ficha con guardia, punto, sitio, fecha/hora, método, distancia, dentro/fuera de rango, novedad y ubicación.</w:t>
+      </w:r>
+    </w:p>
+    <w:p>
+      <w:pPr>
+        <w:pStyle w:val="Heading2"/>
+        <w:spacing w:after="100" w:before="240"/>
+      </w:pPr>
+      <w:r>
+        <w:rPr>
+          <w:b/>
+          <w:bCs/>
+          <w:color w:val="1F3A5F"/>
+        </w:rPr>
+        <w:t xml:space="preserve">7.8 El supervisor</w:t>
+      </w:r>
+    </w:p>
+    <w:p>
+      <w:pPr>
+        <w:pStyle w:val="ListParagraph"/>
+        <w:numPr>
+          <w:ilvl w:val="0"/>
+          <w:numId w:val="2"/>
+        </w:numPr>
+        <w:spacing w:after="60" w:line="268"/>
+      </w:pPr>
+      <w:r>
+        <w:rPr>
+          <w:b/>
+          <w:bCs/>
+          <w:color w:val="222222"/>
+          <w:sz w:val="21"/>
+          <w:szCs w:val="21"/>
+        </w:rPr>
+        <w:t xml:space="preserve">En la web: </w:t>
+      </w:r>
+      <w:r>
+        <w:rPr>
+          <w:color w:val="222222"/>
+          <w:sz w:val="21"/>
+          <w:szCs w:val="21"/>
+        </w:rPr>
+        <w:t xml:space="preserve">planifica el rol de turnos (él como responsable + sus guardias con su sitio), monitorea en vivo, atiende el despacho y supervisa rondines.</w:t>
+      </w:r>
+    </w:p>
+    <w:p>
+      <w:pPr>
+        <w:pStyle w:val="ListParagraph"/>
+        <w:numPr>
+          <w:ilvl w:val="0"/>
+          <w:numId w:val="2"/>
+        </w:numPr>
+        <w:spacing w:after="60" w:line="268"/>
+      </w:pPr>
+      <w:r>
+        <w:rPr>
+          <w:b/>
+          <w:bCs/>
+          <w:color w:val="222222"/>
+          <w:sz w:val="21"/>
+          <w:szCs w:val="21"/>
+        </w:rPr>
+        <w:t xml:space="preserve">En el móvil: </w:t>
+      </w:r>
+      <w:r>
+        <w:rPr>
+          <w:color w:val="222222"/>
+          <w:sz w:val="21"/>
+          <w:szCs w:val="21"/>
+        </w:rPr>
+        <w:t xml:space="preserve">además de operar, tiene Buscar y Supervisión (ver el recorrido de un guardia desde el teléfono). Su propia ubicación también se rastrea como la de cualquier elemento.</w:t>
+      </w:r>
+    </w:p>
+    <w:p>
+      <w:pPr>
+        <w:pStyle w:val="Heading2"/>
+        <w:spacing w:after="100" w:before="240"/>
+      </w:pPr>
+      <w:r>
+        <w:rPr>
+          <w:b/>
+          <w:bCs/>
+          <w:color w:val="1F3A5F"/>
+        </w:rPr>
+        <w:t xml:space="preserve">7.9 Alertas de emergencia</w:t>
+      </w:r>
+    </w:p>
+    <w:p>
+      <w:pPr>
+        <w:pStyle w:val="ListParagraph"/>
+        <w:numPr>
+          <w:ilvl w:val="0"/>
+          <w:numId w:val="2"/>
+        </w:numPr>
+        <w:spacing w:after="60" w:line="268"/>
+      </w:pPr>
+      <w:r>
+        <w:rPr>
+          <w:color w:val="222222"/>
+          <w:sz w:val="21"/>
+          <w:szCs w:val="21"/>
+        </w:rPr>
+        <w:t xml:space="preserve">El guardia puede enviar una alerta de pánico: genera un despacho con su ubicación y transmite video en vivo a la central, que queda como evidencia.</w:t>
+      </w:r>
+    </w:p>
+    <w:p>
+      <w:pPr>
+        <w:pStyle w:val="Heading2"/>
+        <w:spacing w:after="100" w:before="240"/>
+      </w:pPr>
+      <w:r>
+        <w:rPr>
+          <w:b/>
+          <w:bCs/>
+          <w:color w:val="1F3A5F"/>
+        </w:rPr>
+        <w:t xml:space="preserve">7.10 Cómo funciona el rastreo GPS (resumen)</w:t>
+      </w:r>
+    </w:p>
+    <w:p>
+      <w:pPr>
+        <w:pStyle w:val="ListParagraph"/>
+        <w:numPr>
+          <w:ilvl w:val="0"/>
+          <w:numId w:val="2"/>
+        </w:numPr>
+        <w:spacing w:after="60" w:line="268"/>
+      </w:pPr>
+      <w:r>
+        <w:rPr>
+          <w:b/>
+          <w:bCs/>
+          <w:color w:val="222222"/>
+          <w:sz w:val="21"/>
+          <w:szCs w:val="21"/>
+        </w:rPr>
+        <w:t xml:space="preserve">Se activa </w:t>
+      </w:r>
+      <w:r>
+        <w:rPr>
+          <w:color w:val="222222"/>
+          <w:sz w:val="21"/>
+          <w:szCs w:val="21"/>
+        </w:rPr>
+        <w:t xml:space="preserve">cuando el guardia tiene su elemento seleccionado, hay sesión iniciada y el interruptor “Rastreo activo” está encendido. Un servicio en primer plano lo mantiene con la pantalla bloqueada; se detiene al cerrar sesión o quitar el elemento.</w:t>
+      </w:r>
+    </w:p>
+    <w:p>
+      <w:pPr>
+        <w:pStyle w:val="ListParagraph"/>
+        <w:numPr>
+          <w:ilvl w:val="0"/>
+          <w:numId w:val="2"/>
+        </w:numPr>
+        <w:spacing w:after="60" w:line="268"/>
+      </w:pPr>
+      <w:r>
+        <w:rPr>
+          <w:b/>
+          <w:bCs/>
+          <w:color w:val="222222"/>
+          <w:sz w:val="21"/>
+          <w:szCs w:val="21"/>
+        </w:rPr>
+        <w:t xml:space="preserve">Reporta </w:t>
+      </w:r>
+      <w:r>
+        <w:rPr>
+          <w:color w:val="222222"/>
+          <w:sz w:val="21"/>
+          <w:szCs w:val="21"/>
+        </w:rPr>
+        <w:t xml:space="preserve">cada cierto número de segundos (parámetro “Intervalo de reporte”, por defecto 60). En segundo plano, el teléfono puede espaciar los envíos para ahorrar batería.</w:t>
+      </w:r>
+    </w:p>
+    <w:p>
+      <w:pPr>
+        <w:pStyle w:val="ListParagraph"/>
+        <w:numPr>
+          <w:ilvl w:val="0"/>
+          <w:numId w:val="2"/>
+        </w:numPr>
+        <w:spacing w:after="60" w:line="268"/>
+      </w:pPr>
+      <w:r>
+        <w:rPr>
+          <w:b/>
+          <w:bCs/>
+          <w:color w:val="222222"/>
+          <w:sz w:val="21"/>
+          <w:szCs w:val="21"/>
+        </w:rPr>
+        <w:t xml:space="preserve">Cada reporte hace dos cosas: </w:t>
+      </w:r>
+      <w:r>
+        <w:rPr>
+          <w:color w:val="222222"/>
+          <w:sz w:val="21"/>
+          <w:szCs w:val="21"/>
+        </w:rPr>
+        <w:t xml:space="preserve">actualiza la ÚLTIMA posición del guardia (lo que se ve en Monitoreo en vivo) y agrega un punto al HISTORIAL del recorrido (lo que se ve en Supervisión de rondín).</w:t>
+      </w:r>
+    </w:p>
+    <w:p>
+      <w:pPr>
+        <w:pStyle w:val="ListParagraph"/>
+        <w:numPr>
+          <w:ilvl w:val="0"/>
+          <w:numId w:val="2"/>
+        </w:numPr>
+        <w:spacing w:after="60" w:line="268"/>
+      </w:pPr>
+      <w:r>
+        <w:rPr>
+          <w:b/>
+          <w:bCs/>
+          <w:color w:val="222222"/>
+          <w:sz w:val="21"/>
+          <w:szCs w:val="21"/>
+        </w:rPr>
+        <w:t xml:space="preserve">“En línea”: </w:t>
+      </w:r>
+      <w:r>
+        <w:rPr>
+          <w:color w:val="222222"/>
+          <w:sz w:val="21"/>
+          <w:szCs w:val="21"/>
+        </w:rPr>
+        <w:t xml:space="preserve">un guardia se muestra en el mapa si reportó dentro de la “Ventana en línea” (por defecto 180 s); si deja de reportar más tiempo, desaparece del mapa hasta el siguiente envío.</w:t>
+      </w:r>
+    </w:p>
+    <w:p>
+      <w:pPr>
+        <w:pStyle w:val="ListParagraph"/>
+        <w:numPr>
+          <w:ilvl w:val="0"/>
+          <w:numId w:val="2"/>
+        </w:numPr>
+        <w:spacing w:after="60" w:line="268"/>
+      </w:pPr>
+      <w:r>
+        <w:rPr>
+          <w:b/>
+          <w:bCs/>
+          <w:color w:val="222222"/>
+          <w:sz w:val="21"/>
+          <w:szCs w:val="21"/>
+        </w:rPr>
+        <w:t xml:space="preserve">Además del rastreo continuo: </w:t>
+      </w:r>
+      <w:r>
+        <w:rPr>
+          <w:color w:val="222222"/>
+          <w:sz w:val="21"/>
+          <w:szCs w:val="21"/>
+        </w:rPr>
+        <w:t xml:space="preserve">cada rondín (QR/NFC) guarda su propio GPS con la distancia a la etiqueta, y las entradas/salidas del sitio se registran por geocerca.</w:t>
+      </w:r>
+    </w:p>
+    <w:p>
+      <w:pPr>
+        <w:pStyle w:val="ListParagraph"/>
+        <w:numPr>
+          <w:ilvl w:val="0"/>
+          <w:numId w:val="2"/>
+        </w:numPr>
+        <w:spacing w:after="60" w:line="268"/>
+      </w:pPr>
+      <w:r>
+        <w:rPr>
+          <w:b/>
+          <w:bCs/>
+          <w:color w:val="222222"/>
+          <w:sz w:val="21"/>
+          <w:szCs w:val="21"/>
+        </w:rPr>
+        <w:t xml:space="preserve">Quién lo ve: </w:t>
+      </w:r>
+      <w:r>
+        <w:rPr>
+          <w:color w:val="222222"/>
+          <w:sz w:val="21"/>
+          <w:szCs w:val="21"/>
+        </w:rPr>
+        <w:t xml:space="preserve">la ubicación de los guardias solo es visible para supervisor/administrador.</w:t>
+      </w:r>
+    </w:p>
+    <w:p>
+      <w:pPr>
+        <w:spacing w:after="60"/>
+      </w:pPr>
+    </w:p>
+    <w:p>
+      <w:pPr>
+        <w:spacing w:after="120" w:line="276"/>
+      </w:pPr>
+      <w:r>
+        <w:rPr>
+          <w:b/>
+          <w:bCs/>
+          <w:color w:val="222222"/>
+          <w:sz w:val="21"/>
+          <w:szCs w:val="21"/>
+        </w:rPr>
+        <w:t xml:space="preserve">Parámetros que lo controlan (Parámetros del sistema):</w:t>
+      </w:r>
+    </w:p>
+    <w:tbl>
+      <w:tblPr>
+        <w:tblW w:type="dxa" w:w="9360"/>
+        <w:tblBorders>
+          <w:top w:val="single" w:color="auto" w:sz="4"/>
+          <w:left w:val="single" w:color="auto" w:sz="4"/>
+          <w:bottom w:val="single" w:color="auto" w:sz="4"/>
+          <w:right w:val="single" w:color="auto" w:sz="4"/>
+          <w:insideH w:val="single" w:color="auto" w:sz="4"/>
+          <w:insideV w:val="single" w:color="auto" w:sz="4"/>
+        </w:tblBorders>
+      </w:tblPr>
+      <w:tblGrid>
+        <w:gridCol w:w="2600"/>
+        <w:gridCol w:w="5360"/>
+        <w:gridCol w:w="1400"/>
+      </w:tblGrid>
+      <w:tr>
+        <w:trPr>
+          <w:tblHeader/>
+        </w:trPr>
+        <w:tc>
+          <w:tcPr>
+            <w:tcW w:type="dxa" w:w="2600"/>
+            <w:shd w:fill="1F3A5F" w:color="auto" w:val="clear"/>
+            <w:tcMar>
+              <w:top w:type="dxa" w:w="60"/>
+              <w:left w:type="dxa" w:w="100"/>
+              <w:bottom w:type="dxa" w:w="60"/>
+              <w:right w:type="dxa" w:w="100"/>
+            </w:tcMar>
+          </w:tcPr>
+          <w:p>
+            <w:r>
+              <w:rPr>
+                <w:b/>
+                <w:bCs/>
+                <w:color w:val="FFFFFF"/>
+                <w:sz w:val="20"/>
+                <w:szCs w:val="20"/>
+              </w:rPr>
+              <w:t xml:space="preserve">Parámetro</w:t>
+            </w:r>
+          </w:p>
+        </w:tc>
+        <w:tc>
+          <w:tcPr>
+            <w:tcW w:type="dxa" w:w="5360"/>
+            <w:shd w:fill="1F3A5F" w:color="auto" w:val="clear"/>
+            <w:tcMar>
+              <w:top w:type="dxa" w:w="60"/>
+              <w:left w:type="dxa" w:w="100"/>
+              <w:bottom w:type="dxa" w:w="60"/>
+              <w:right w:type="dxa" w:w="100"/>
+            </w:tcMar>
+          </w:tcPr>
+          <w:p>
+            <w:r>
+              <w:rPr>
+                <w:b/>
+                <w:bCs/>
+                <w:color w:val="FFFFFF"/>
+                <w:sz w:val="20"/>
+                <w:szCs w:val="20"/>
+              </w:rPr>
+              <w:t xml:space="preserve">Qué hace</w:t>
+            </w:r>
+          </w:p>
+        </w:tc>
+        <w:tc>
+          <w:tcPr>
+            <w:tcW w:type="dxa" w:w="1400"/>
+            <w:shd w:fill="1F3A5F" w:color="auto" w:val="clear"/>
+            <w:tcMar>
+              <w:top w:type="dxa" w:w="60"/>
+              <w:left w:type="dxa" w:w="100"/>
+              <w:bottom w:type="dxa" w:w="60"/>
+              <w:right w:type="dxa" w:w="100"/>
+            </w:tcMar>
+          </w:tcPr>
+          <w:p>
+            <w:r>
+              <w:rPr>
+                <w:b/>
+                <w:bCs/>
+                <w:color w:val="FFFFFF"/>
+                <w:sz w:val="20"/>
+                <w:szCs w:val="20"/>
+              </w:rPr>
+              <w:t xml:space="preserve">Default</w:t>
+            </w:r>
+          </w:p>
+        </w:tc>
+      </w:tr>
+      <w:tr>
+        <w:tc>
+          <w:tcPr>
+            <w:tcW w:type="dxa" w:w="2600"/>
+            <w:shd w:fill="FFFFFF" w:color="auto" w:val="clear"/>
+            <w:tcMar>
+              <w:top w:type="dxa" w:w="50"/>
+              <w:left w:type="dxa" w:w="100"/>
+              <w:bottom w:type="dxa" w:w="50"/>
+              <w:right w:type="dxa" w:w="100"/>
+            </w:tcMar>
+          </w:tcPr>
+          <w:p>
+            <w:r>
+              <w:rPr>
+                <w:color w:val="222222"/>
+                <w:sz w:val="20"/>
+                <w:szCs w:val="20"/>
+              </w:rPr>
+              <w:t xml:space="preserve">Rastreo activo</w:t>
+            </w:r>
+          </w:p>
+        </w:tc>
+        <w:tc>
+          <w:tcPr>
+            <w:tcW w:type="dxa" w:w="5360"/>
+            <w:shd w:fill="FFFFFF" w:color="auto" w:val="clear"/>
+            <w:tcMar>
+              <w:top w:type="dxa" w:w="50"/>
+              <w:left w:type="dxa" w:w="100"/>
+              <w:bottom w:type="dxa" w:w="50"/>
+              <w:right w:type="dxa" w:w="100"/>
+            </w:tcMar>
+          </w:tcPr>
+          <w:p>
+            <w:r>
+              <w:rPr>
+                <w:color w:val="222222"/>
+                <w:sz w:val="20"/>
+                <w:szCs w:val="20"/>
+              </w:rPr>
+              <w:t xml:space="preserve">Enciende/apaga el rastreo GPS de guardias</w:t>
+            </w:r>
+          </w:p>
+        </w:tc>
+        <w:tc>
+          <w:tcPr>
+            <w:tcW w:type="dxa" w:w="1400"/>
+            <w:shd w:fill="FFFFFF" w:color="auto" w:val="clear"/>
+            <w:tcMar>
+              <w:top w:type="dxa" w:w="50"/>
+              <w:left w:type="dxa" w:w="100"/>
+              <w:bottom w:type="dxa" w:w="50"/>
+              <w:right w:type="dxa" w:w="100"/>
+            </w:tcMar>
+          </w:tcPr>
+          <w:p>
+            <w:r>
+              <w:rPr>
+                <w:color w:val="222222"/>
+                <w:sz w:val="20"/>
+                <w:szCs w:val="20"/>
+              </w:rPr>
+              <w:t xml:space="preserve">Sí</w:t>
+            </w:r>
+          </w:p>
+        </w:tc>
+      </w:tr>
+      <w:tr>
+        <w:tc>
+          <w:tcPr>
+            <w:tcW w:type="dxa" w:w="2600"/>
+            <w:shd w:fill="EEF1F4" w:color="auto" w:val="clear"/>
+            <w:tcMar>
+              <w:top w:type="dxa" w:w="50"/>
+              <w:left w:type="dxa" w:w="100"/>
+              <w:bottom w:type="dxa" w:w="50"/>
+              <w:right w:type="dxa" w:w="100"/>
+            </w:tcMar>
+          </w:tcPr>
+          <w:p>
+            <w:r>
+              <w:rPr>
+                <w:color w:val="222222"/>
+                <w:sz w:val="20"/>
+                <w:szCs w:val="20"/>
+              </w:rPr>
+              <w:t xml:space="preserve">Intervalo de reporte</w:t>
+            </w:r>
+          </w:p>
+        </w:tc>
+        <w:tc>
+          <w:tcPr>
+            <w:tcW w:type="dxa" w:w="5360"/>
+            <w:shd w:fill="EEF1F4" w:color="auto" w:val="clear"/>
+            <w:tcMar>
+              <w:top w:type="dxa" w:w="50"/>
+              <w:left w:type="dxa" w:w="100"/>
+              <w:bottom w:type="dxa" w:w="50"/>
+              <w:right w:type="dxa" w:w="100"/>
+            </w:tcMar>
+          </w:tcPr>
+          <w:p>
+            <w:r>
+              <w:rPr>
+                <w:color w:val="222222"/>
+                <w:sz w:val="20"/>
+                <w:szCs w:val="20"/>
+              </w:rPr>
+              <w:t xml:space="preserve">Cada cuántos segundos reporta el móvil</w:t>
+            </w:r>
+          </w:p>
+        </w:tc>
+        <w:tc>
+          <w:tcPr>
+            <w:tcW w:type="dxa" w:w="1400"/>
+            <w:shd w:fill="EEF1F4" w:color="auto" w:val="clear"/>
+            <w:tcMar>
+              <w:top w:type="dxa" w:w="50"/>
+              <w:left w:type="dxa" w:w="100"/>
+              <w:bottom w:type="dxa" w:w="50"/>
+              <w:right w:type="dxa" w:w="100"/>
+            </w:tcMar>
+          </w:tcPr>
+          <w:p>
+            <w:r>
+              <w:rPr>
+                <w:color w:val="222222"/>
+                <w:sz w:val="20"/>
+                <w:szCs w:val="20"/>
+              </w:rPr>
+              <w:t xml:space="preserve">60 s</w:t>
+            </w:r>
+          </w:p>
+        </w:tc>
+      </w:tr>
+      <w:tr>
+        <w:tc>
+          <w:tcPr>
+            <w:tcW w:type="dxa" w:w="2600"/>
+            <w:shd w:fill="FFFFFF" w:color="auto" w:val="clear"/>
+            <w:tcMar>
+              <w:top w:type="dxa" w:w="50"/>
+              <w:left w:type="dxa" w:w="100"/>
+              <w:bottom w:type="dxa" w:w="50"/>
+              <w:right w:type="dxa" w:w="100"/>
+            </w:tcMar>
+          </w:tcPr>
+          <w:p>
+            <w:r>
+              <w:rPr>
+                <w:color w:val="222222"/>
+                <w:sz w:val="20"/>
+                <w:szCs w:val="20"/>
+              </w:rPr>
+              <w:t xml:space="preserve">Ventana “en línea”</w:t>
+            </w:r>
+          </w:p>
+        </w:tc>
+        <w:tc>
+          <w:tcPr>
+            <w:tcW w:type="dxa" w:w="5360"/>
+            <w:shd w:fill="FFFFFF" w:color="auto" w:val="clear"/>
+            <w:tcMar>
+              <w:top w:type="dxa" w:w="50"/>
+              <w:left w:type="dxa" w:w="100"/>
+              <w:bottom w:type="dxa" w:w="50"/>
+              <w:right w:type="dxa" w:w="100"/>
+            </w:tcMar>
+          </w:tcPr>
+          <w:p>
+            <w:r>
+              <w:rPr>
+                <w:color w:val="222222"/>
+                <w:sz w:val="20"/>
+                <w:szCs w:val="20"/>
+              </w:rPr>
+              <w:t xml:space="preserve">Segundos sin reportar tras los que cae del mapa</w:t>
+            </w:r>
+          </w:p>
+        </w:tc>
+        <w:tc>
+          <w:tcPr>
+            <w:tcW w:type="dxa" w:w="1400"/>
+            <w:shd w:fill="FFFFFF" w:color="auto" w:val="clear"/>
+            <w:tcMar>
+              <w:top w:type="dxa" w:w="50"/>
+              <w:left w:type="dxa" w:w="100"/>
+              <w:bottom w:type="dxa" w:w="50"/>
+              <w:right w:type="dxa" w:w="100"/>
+            </w:tcMar>
+          </w:tcPr>
+          <w:p>
+            <w:r>
+              <w:rPr>
+                <w:color w:val="222222"/>
+                <w:sz w:val="20"/>
+                <w:szCs w:val="20"/>
+              </w:rPr>
+              <w:t xml:space="preserve">180 s</w:t>
+            </w:r>
+          </w:p>
+        </w:tc>
+      </w:tr>
+      <w:tr>
+        <w:tc>
+          <w:tcPr>
+            <w:tcW w:type="dxa" w:w="2600"/>
+            <w:shd w:fill="EEF1F4" w:color="auto" w:val="clear"/>
+            <w:tcMar>
+              <w:top w:type="dxa" w:w="50"/>
+              <w:left w:type="dxa" w:w="100"/>
+              <w:bottom w:type="dxa" w:w="50"/>
+              <w:right w:type="dxa" w:w="100"/>
+            </w:tcMar>
+          </w:tcPr>
+          <w:p>
+            <w:r>
+              <w:rPr>
+                <w:color w:val="222222"/>
+                <w:sz w:val="20"/>
+                <w:szCs w:val="20"/>
+              </w:rPr>
+              <w:t xml:space="preserve">Margen de geocerca</w:t>
+            </w:r>
+          </w:p>
+        </w:tc>
+        <w:tc>
+          <w:tcPr>
+            <w:tcW w:type="dxa" w:w="5360"/>
+            <w:shd w:fill="EEF1F4" w:color="auto" w:val="clear"/>
+            <w:tcMar>
+              <w:top w:type="dxa" w:w="50"/>
+              <w:left w:type="dxa" w:w="100"/>
+              <w:bottom w:type="dxa" w:w="50"/>
+              <w:right w:type="dxa" w:w="100"/>
+            </w:tcMar>
+          </w:tcPr>
+          <w:p>
+            <w:r>
+              <w:rPr>
+                <w:color w:val="222222"/>
+                <w:sz w:val="20"/>
+                <w:szCs w:val="20"/>
+              </w:rPr>
+              <w:t xml:space="preserve">± metros de tolerancia al validar el rondín</w:t>
+            </w:r>
+          </w:p>
+        </w:tc>
+        <w:tc>
+          <w:tcPr>
+            <w:tcW w:type="dxa" w:w="1400"/>
+            <w:shd w:fill="EEF1F4" w:color="auto" w:val="clear"/>
+            <w:tcMar>
+              <w:top w:type="dxa" w:w="50"/>
+              <w:left w:type="dxa" w:w="100"/>
+              <w:bottom w:type="dxa" w:w="50"/>
+              <w:right w:type="dxa" w:w="100"/>
+            </w:tcMar>
+          </w:tcPr>
+          <w:p>
+            <w:r>
+              <w:rPr>
+                <w:color w:val="222222"/>
+                <w:sz w:val="20"/>
+                <w:szCs w:val="20"/>
+              </w:rPr>
+              <w:t xml:space="preserve">20 m</w:t>
+            </w:r>
+          </w:p>
+        </w:tc>
+      </w:tr>
+    </w:tbl>
+    <w:p>
+      <w:r>
+        <w:br w:type="page"/>
+      </w:r>
+    </w:p>
+    <w:p>
+      <w:pPr>
+        <w:pStyle w:val="Heading1"/>
+        <w:spacing w:after="160" w:before="320"/>
+      </w:pPr>
+      <w:r>
+        <w:rPr>
+          <w:b/>
+          <w:bCs/>
+          <w:color w:val="1F3A5F"/>
+        </w:rPr>
+        <w:t xml:space="preserve">8. Principios que el usuario debe conocer</w:t>
       </w:r>
     </w:p>
     <w:p>
@@ -3243,7 +4444,7 @@
           <w:sz w:val="16"/>
           <w:szCs w:val="16"/>
         </w:rPr>
-        <w:t xml:space="preserve">SGS — Sistema de Gestión de Seguridad · Documento de flujo operativo funcional · v2.0</w:t>
+        <w:t xml:space="preserve">SGS — Sistema de Gestión de Seguridad · Documento de flujo operativo funcional · v2.1</w:t>
       </w:r>
     </w:p>
     <w:sectPr>

</xml_diff>

<commit_message>
SGS venta: flujo operativo v2.2 con Videovigilancia
Agrega la seccion 4.3 Videovigilancia (camaras): alta por sitio (busqueda
Windy a la redonda / manual del NVR), muro de hasta 24 camaras con pantalla
completa, abrir camara en muro desde lista y mapa, y camaras cercanas a la
incidencia. Menciones en 4.1 (Central/Despacho), 4.2 y 7.6 (Monitoreo).
Renumeracion 4.4-4.10. Version 2.2.

Co-Authored-By: Claude Opus 4.8 <noreply@anthropic.com>
</commit_message>
<xml_diff>
--- a/docs/venta/SGS-Flujo-Operativo.docx
+++ b/docs/venta/SGS-Flujo-Operativo.docx
@@ -114,7 +114,7 @@
           <w:sz w:val="20"/>
           <w:szCs w:val="20"/>
         </w:rPr>
-        <w:t xml:space="preserve">Versión 2.1 · Agosto 2026</w:t>
+        <w:t xml:space="preserve">Versión 2.2 · Agosto 2026</w:t>
       </w:r>
     </w:p>
     <w:p>
@@ -1206,6 +1206,34 @@
       </w:pPr>
       <w:r>
         <w:rPr>
+          <w:b/>
+          <w:bCs/>
+          <w:color w:val="222222"/>
+          <w:sz w:val="21"/>
+          <w:szCs w:val="21"/>
+        </w:rPr>
+        <w:t xml:space="preserve">Cámaras cercanas: </w:t>
+      </w:r>
+      <w:r>
+        <w:rPr>
+          <w:color w:val="222222"/>
+          <w:sz w:val="21"/>
+          <w:szCs w:val="21"/>
+        </w:rPr>
+        <w:t xml:space="preserve">muestra las cámaras de videovigilancia del entorno de la incidencia/alerta, ordenadas por distancia (radio en metros ajustable), para abrir la que cubre el evento sin buscar entre todas.</w:t>
+      </w:r>
+    </w:p>
+    <w:p>
+      <w:pPr>
+        <w:pStyle w:val="ListParagraph"/>
+        <w:numPr>
+          <w:ilvl w:val="0"/>
+          <w:numId w:val="2"/>
+        </w:numPr>
+        <w:spacing w:after="60" w:line="268"/>
+      </w:pPr>
+      <w:r>
+        <w:rPr>
           <w:color w:val="222222"/>
           <w:sz w:val="21"/>
           <w:szCs w:val="21"/>
@@ -1311,7 +1339,7 @@
           <w:sz w:val="21"/>
           <w:szCs w:val="21"/>
         </w:rPr>
-        <w:t xml:space="preserve">(punto azul en vivo) e </w:t>
+        <w:t xml:space="preserve">(punto azul en vivo), </w:t>
       </w:r>
       <w:r>
         <w:rPr>
@@ -1329,25 +1357,43 @@
           <w:sz w:val="21"/>
           <w:szCs w:val="21"/>
         </w:rPr>
-        <w:t xml:space="preserve">(triángulo rojo).</w:t>
-      </w:r>
-    </w:p>
-    <w:p>
-      <w:pPr>
-        <w:pStyle w:val="ListParagraph"/>
-        <w:numPr>
-          <w:ilvl w:val="0"/>
-          <w:numId w:val="2"/>
-        </w:numPr>
-        <w:spacing w:after="60" w:line="268"/>
-      </w:pPr>
-      <w:r>
-        <w:rPr>
-          <w:color w:val="222222"/>
-          <w:sz w:val="21"/>
-          <w:szCs w:val="21"/>
-        </w:rPr>
-        <w:t xml:space="preserve">Al hacer clic en un guardia, su globo muestra su estatus actual: En posición, En rondín o En pausa (con motivo). En un incidente muestra su estado (recibida/despachado/en atención); los cerrados ya no aparecen en el mapa.</w:t>
+        <w:t xml:space="preserve">(triángulo rojo) y </w:t>
+      </w:r>
+      <w:r>
+        <w:rPr>
+          <w:b/>
+          <w:bCs/>
+          <w:color w:val="222222"/>
+          <w:sz w:val="21"/>
+          <w:szCs w:val="21"/>
+        </w:rPr>
+        <w:t xml:space="preserve">cámaras de videovigilancia </w:t>
+      </w:r>
+      <w:r>
+        <w:rPr>
+          <w:color w:val="222222"/>
+          <w:sz w:val="21"/>
+          <w:szCs w:val="21"/>
+        </w:rPr>
+        <w:t xml:space="preserve">(círculo morado).</w:t>
+      </w:r>
+    </w:p>
+    <w:p>
+      <w:pPr>
+        <w:pStyle w:val="ListParagraph"/>
+        <w:numPr>
+          <w:ilvl w:val="0"/>
+          <w:numId w:val="2"/>
+        </w:numPr>
+        <w:spacing w:after="60" w:line="268"/>
+      </w:pPr>
+      <w:r>
+        <w:rPr>
+          <w:color w:val="222222"/>
+          <w:sz w:val="21"/>
+          <w:szCs w:val="21"/>
+        </w:rPr>
+        <w:t xml:space="preserve">Al hacer clic en un guardia, su globo muestra su estatus actual: En posición, En rondín o En pausa (con motivo). En un incidente muestra su estado (recibida/despachado/en atención); los cerrados ya no aparecen en el mapa. En una cámara, el globo permite abrirla directamente en el muro de videovigilancia.</w:t>
       </w:r>
     </w:p>
     <w:p>
@@ -1397,7 +1443,7 @@
           <w:bCs/>
           <w:color w:val="1F3A5F"/>
         </w:rPr>
-        <w:t xml:space="preserve">4.3 Sitios / Puestos de servicio</w:t>
+        <w:t xml:space="preserve">4.3 Videovigilancia (cámaras)</w:t>
       </w:r>
     </w:p>
     <w:p>
@@ -1420,25 +1466,170 @@
           <w:sz w:val="21"/>
           <w:szCs w:val="21"/>
         </w:rPr>
-        <w:t xml:space="preserve">el lugar físico donde se presta la seguridad; unidad operativa de turnos, puntos de control y rondines.</w:t>
-      </w:r>
-    </w:p>
-    <w:p>
-      <w:pPr>
-        <w:pStyle w:val="ListParagraph"/>
-        <w:numPr>
-          <w:ilvl w:val="0"/>
-          <w:numId w:val="2"/>
-        </w:numPr>
-        <w:spacing w:after="60" w:line="268"/>
-      </w:pPr>
-      <w:r>
-        <w:rPr>
-          <w:color w:val="222222"/>
-          <w:sz w:val="21"/>
-          <w:szCs w:val="21"/>
-        </w:rPr>
-        <w:t xml:space="preserve">Se crea eligiendo el cliente; se define tipo, dirección, número de guardias, horario y su ubicación en el mapa (para monitoreo y supervisión).</w:t>
+        <w:t xml:space="preserve">vigilar en vivo las cámaras fijas (CCTV) de cada sitio y tenerlas a la mano al atender una incidencia. Complementa la transmisión de la bodycam del guardia: aquí son cámaras fijas del lugar, no la cámara móvil del elemento. El video no se guarda; solo se identifica la cámara y su señal se resuelve en el momento.</w:t>
+      </w:r>
+    </w:p>
+    <w:p>
+      <w:pPr>
+        <w:spacing w:after="120" w:line="276"/>
+      </w:pPr>
+      <w:r>
+        <w:rPr>
+          <w:b/>
+          <w:bCs/>
+          <w:color w:val="222222"/>
+          <w:sz w:val="21"/>
+          <w:szCs w:val="21"/>
+        </w:rPr>
+        <w:t xml:space="preserve">Alta de cámaras (por sitio):</w:t>
+      </w:r>
+    </w:p>
+    <w:p>
+      <w:pPr>
+        <w:pStyle w:val="ListParagraph"/>
+        <w:numPr>
+          <w:ilvl w:val="0"/>
+          <w:numId w:val="4"/>
+        </w:numPr>
+        <w:spacing w:after="70" w:line="268"/>
+      </w:pPr>
+      <w:r>
+        <w:rPr>
+          <w:color w:val="222222"/>
+          <w:sz w:val="21"/>
+          <w:szCs w:val="21"/>
+        </w:rPr>
+        <w:t xml:space="preserve">Se elige el sitio; el sistema toma sus coordenadas y busca las cámaras alrededor (radio a la redonda configurable en metros), dando de alta las nuevas automáticamente — sin capturar ningún identificador ni URL.</w:t>
+      </w:r>
+    </w:p>
+    <w:p>
+      <w:pPr>
+        <w:pStyle w:val="ListParagraph"/>
+        <w:numPr>
+          <w:ilvl w:val="0"/>
+          <w:numId w:val="4"/>
+        </w:numPr>
+        <w:spacing w:after="70" w:line="268"/>
+      </w:pPr>
+      <w:r>
+        <w:rPr>
+          <w:color w:val="222222"/>
+          <w:sz w:val="21"/>
+          <w:szCs w:val="21"/>
+        </w:rPr>
+        <w:t xml:space="preserve">Como alternativa, se agrega una cámara manual del propio cliente (NVR/DVR) pegando la URL de su transmisión (HLS/MJPEG/embed) y ubicándola en el mapa.</w:t>
+      </w:r>
+    </w:p>
+    <w:p>
+      <w:pPr>
+        <w:pStyle w:val="ListParagraph"/>
+        <w:numPr>
+          <w:ilvl w:val="0"/>
+          <w:numId w:val="2"/>
+        </w:numPr>
+        <w:spacing w:after="60" w:line="268"/>
+      </w:pPr>
+      <w:r>
+        <w:rPr>
+          <w:b/>
+          <w:bCs/>
+          <w:color w:val="222222"/>
+          <w:sz w:val="21"/>
+          <w:szCs w:val="21"/>
+        </w:rPr>
+        <w:t xml:space="preserve">Muro de cámaras: </w:t>
+      </w:r>
+      <w:r>
+        <w:rPr>
+          <w:color w:val="222222"/>
+          <w:sz w:val="21"/>
+          <w:szCs w:val="21"/>
+        </w:rPr>
+        <w:t xml:space="preserve">el monitorista arma un muro con hasta 24 cámaras, con buscador y filtro por sitio; cada cámara se refresca sola y puede maximizarse a pantalla completa. La selección se conserva entre sesiones.</w:t>
+      </w:r>
+    </w:p>
+    <w:p>
+      <w:pPr>
+        <w:pStyle w:val="ListParagraph"/>
+        <w:numPr>
+          <w:ilvl w:val="0"/>
+          <w:numId w:val="2"/>
+        </w:numPr>
+        <w:spacing w:after="60" w:line="268"/>
+      </w:pPr>
+      <w:r>
+        <w:rPr>
+          <w:b/>
+          <w:bCs/>
+          <w:color w:val="222222"/>
+          <w:sz w:val="21"/>
+          <w:szCs w:val="21"/>
+        </w:rPr>
+        <w:t xml:space="preserve">Abrir una cámara en el muro: </w:t>
+      </w:r>
+      <w:r>
+        <w:rPr>
+          <w:color w:val="222222"/>
+          <w:sz w:val="21"/>
+          <w:szCs w:val="21"/>
+        </w:rPr>
+        <w:t xml:space="preserve">desde la lista de cámaras o desde el mapa de Monitoreo en vivo, con un clic la cámara se abre directamente en el muro.</w:t>
+      </w:r>
+    </w:p>
+    <w:p>
+      <w:pPr>
+        <w:pStyle w:val="ListParagraph"/>
+        <w:numPr>
+          <w:ilvl w:val="0"/>
+          <w:numId w:val="2"/>
+        </w:numPr>
+        <w:spacing w:after="60" w:line="268"/>
+      </w:pPr>
+      <w:r>
+        <w:rPr>
+          <w:b/>
+          <w:bCs/>
+          <w:color w:val="222222"/>
+          <w:sz w:val="21"/>
+          <w:szCs w:val="21"/>
+        </w:rPr>
+        <w:t xml:space="preserve">Cámaras cercanas a una incidencia: </w:t>
+      </w:r>
+      <w:r>
+        <w:rPr>
+          <w:color w:val="222222"/>
+          <w:sz w:val="21"/>
+          <w:szCs w:val="21"/>
+        </w:rPr>
+        <w:t xml:space="preserve">al atender una alerta/incidencia en Central/Despacho, el sistema ofrece las cámaras del entorno ordenadas por distancia (radio en metros ajustable).</w:t>
+      </w:r>
+    </w:p>
+    <w:p>
+      <w:pPr>
+        <w:pStyle w:val="ListParagraph"/>
+        <w:numPr>
+          <w:ilvl w:val="0"/>
+          <w:numId w:val="2"/>
+        </w:numPr>
+        <w:spacing w:after="60" w:line="268"/>
+      </w:pPr>
+      <w:r>
+        <w:rPr>
+          <w:b/>
+          <w:bCs/>
+          <w:color w:val="222222"/>
+          <w:sz w:val="21"/>
+          <w:szCs w:val="21"/>
+        </w:rPr>
+        <w:t xml:space="preserve">Estado operativo </w:t>
+      </w:r>
+      <w:r>
+        <w:rPr>
+          <w:color w:val="222222"/>
+          <w:sz w:val="21"/>
+          <w:szCs w:val="21"/>
+        </w:rPr>
+        <w:t xml:space="preserve">por cámara (activa / inactiva / en mantenimiento); solo las activas se muestran en el mapa y en el muro. La llave del proveedor de video nunca queda expuesta en el navegador.</w:t>
       </w:r>
     </w:p>
     <w:p>
@@ -1452,7 +1643,7 @@
           <w:bCs/>
           <w:color w:val="1F3A5F"/>
         </w:rPr>
-        <w:t xml:space="preserve">4.4 Puntos de control y códigos QR</w:t>
+        <w:t xml:space="preserve">4.4 Sitios / Puestos de servicio</w:t>
       </w:r>
     </w:p>
     <w:p>
@@ -1475,76 +1666,25 @@
           <w:sz w:val="21"/>
           <w:szCs w:val="21"/>
         </w:rPr>
-        <w:t xml:space="preserve">los checkpoints de un sitio que el guardia visita en sus rondas; cada uno tiene un código único que se materializa como QR.</w:t>
-      </w:r>
-    </w:p>
-    <w:p>
-      <w:pPr>
-        <w:spacing w:after="120" w:line="276"/>
-      </w:pPr>
-      <w:r>
-        <w:rPr>
-          <w:b/>
-          <w:bCs/>
-          <w:color w:val="222222"/>
-          <w:sz w:val="21"/>
-          <w:szCs w:val="21"/>
-        </w:rPr>
-        <w:t xml:space="preserve">Flujo:</w:t>
-      </w:r>
-    </w:p>
-    <w:p>
-      <w:pPr>
-        <w:pStyle w:val="ListParagraph"/>
-        <w:numPr>
-          <w:ilvl w:val="0"/>
-          <w:numId w:val="4"/>
-        </w:numPr>
-        <w:spacing w:after="70" w:line="268"/>
-      </w:pPr>
-      <w:r>
-        <w:rPr>
-          <w:color w:val="222222"/>
-          <w:sz w:val="21"/>
-          <w:szCs w:val="21"/>
-        </w:rPr>
-        <w:t xml:space="preserve">Se crea el punto eligiendo el sitio; el sistema propone un código único (también sirve para tag NFC), con orden y descripción.</w:t>
-      </w:r>
-    </w:p>
-    <w:p>
-      <w:pPr>
-        <w:pStyle w:val="ListParagraph"/>
-        <w:numPr>
-          <w:ilvl w:val="0"/>
-          <w:numId w:val="4"/>
-        </w:numPr>
-        <w:spacing w:after="70" w:line="268"/>
-      </w:pPr>
-      <w:r>
-        <w:rPr>
-          <w:color w:val="222222"/>
-          <w:sz w:val="21"/>
-          <w:szCs w:val="21"/>
-        </w:rPr>
-        <w:t xml:space="preserve">Desde la ficha del punto se ve su código QR y se puede imprimir: uno, todos los del sitio o todos los puntos, en una hoja de etiquetas (sitio, punto y código).</w:t>
-      </w:r>
-    </w:p>
-    <w:p>
-      <w:pPr>
-        <w:pStyle w:val="ListParagraph"/>
-        <w:numPr>
-          <w:ilvl w:val="0"/>
-          <w:numId w:val="4"/>
-        </w:numPr>
-        <w:spacing w:after="70" w:line="268"/>
-      </w:pPr>
-      <w:r>
-        <w:rPr>
-          <w:color w:val="222222"/>
-          <w:sz w:val="21"/>
-          <w:szCs w:val="21"/>
-        </w:rPr>
-        <w:t xml:space="preserve">El QR impreso se coloca físicamente en el punto; su contenido es lo que valida el sistema al escanearlo desde el móvil.</w:t>
+        <w:t xml:space="preserve">el lugar físico donde se presta la seguridad; unidad operativa de turnos, puntos de control y rondines.</w:t>
+      </w:r>
+    </w:p>
+    <w:p>
+      <w:pPr>
+        <w:pStyle w:val="ListParagraph"/>
+        <w:numPr>
+          <w:ilvl w:val="0"/>
+          <w:numId w:val="2"/>
+        </w:numPr>
+        <w:spacing w:after="60" w:line="268"/>
+      </w:pPr>
+      <w:r>
+        <w:rPr>
+          <w:color w:val="222222"/>
+          <w:sz w:val="21"/>
+          <w:szCs w:val="21"/>
+        </w:rPr>
+        <w:t xml:space="preserve">Se crea eligiendo el cliente; se define tipo, dirección, número de guardias, horario y su ubicación en el mapa (para monitoreo y supervisión).</w:t>
       </w:r>
     </w:p>
     <w:p>
@@ -1558,7 +1698,7 @@
           <w:bCs/>
           <w:color w:val="1F3A5F"/>
         </w:rPr>
-        <w:t xml:space="preserve">4.5 Rondines (verificados con QR/NFC y geocerca)</w:t>
+        <w:t xml:space="preserve">4.5 Puntos de control y códigos QR</w:t>
       </w:r>
     </w:p>
     <w:p>
@@ -1581,89 +1721,76 @@
           <w:sz w:val="21"/>
           <w:szCs w:val="21"/>
         </w:rPr>
-        <w:t xml:space="preserve">la evidencia de que el guardia recorrió realmente los puntos de control.</w:t>
-      </w:r>
-    </w:p>
-    <w:p>
-      <w:pPr>
-        <w:pStyle w:val="ListParagraph"/>
-        <w:numPr>
-          <w:ilvl w:val="0"/>
-          <w:numId w:val="2"/>
-        </w:numPr>
-        <w:spacing w:after="60" w:line="268"/>
-      </w:pPr>
-      <w:r>
-        <w:rPr>
-          <w:color w:val="222222"/>
-          <w:sz w:val="21"/>
-          <w:szCs w:val="21"/>
-        </w:rPr>
-        <w:t xml:space="preserve">Cada paso proviene del campo: el guardia lee el punto por QR o por etiqueta NFC; el móvil registra guardia, hora, GPS y novedad.</w:t>
-      </w:r>
-    </w:p>
-    <w:p>
-      <w:pPr>
-        <w:pStyle w:val="ListParagraph"/>
-        <w:numPr>
-          <w:ilvl w:val="0"/>
-          <w:numId w:val="2"/>
-        </w:numPr>
-        <w:spacing w:after="60" w:line="268"/>
-      </w:pPr>
-      <w:r>
-        <w:rPr>
-          <w:b/>
-          <w:bCs/>
-          <w:color w:val="222222"/>
-          <w:sz w:val="21"/>
-          <w:szCs w:val="21"/>
-        </w:rPr>
-        <w:t xml:space="preserve">Validación de lugar (geocerca): </w:t>
-      </w:r>
-      <w:r>
-        <w:rPr>
-          <w:color w:val="222222"/>
-          <w:sz w:val="21"/>
-          <w:szCs w:val="21"/>
-        </w:rPr>
-        <w:t xml:space="preserve">el sistema calcula la distancia entre el guardia y la etiqueta y verifica que esté dentro del radio del punto más un margen de tolerancia por GPS. Si está fuera, el paso se registra pero queda marcado como “fuera de rango”.</w:t>
-      </w:r>
-    </w:p>
-    <w:p>
-      <w:pPr>
-        <w:pStyle w:val="ListParagraph"/>
-        <w:numPr>
-          <w:ilvl w:val="0"/>
-          <w:numId w:val="2"/>
-        </w:numPr>
-        <w:spacing w:after="60" w:line="268"/>
-      </w:pPr>
-      <w:r>
-        <w:rPr>
-          <w:color w:val="222222"/>
-          <w:sz w:val="21"/>
-          <w:szCs w:val="21"/>
-        </w:rPr>
-        <w:t xml:space="preserve">Cada lectura guarda además el método (QR/NFC), el tipo de evento (entrada/salida/control) y la distancia a la etiqueta.</w:t>
-      </w:r>
-    </w:p>
-    <w:p>
-      <w:pPr>
-        <w:pStyle w:val="ListParagraph"/>
-        <w:numPr>
-          <w:ilvl w:val="0"/>
-          <w:numId w:val="2"/>
-        </w:numPr>
-        <w:spacing w:after="60" w:line="268"/>
-      </w:pPr>
-      <w:r>
-        <w:rPr>
-          <w:color w:val="222222"/>
-          <w:sz w:val="21"/>
-          <w:szCs w:val="21"/>
-        </w:rPr>
-        <w:t xml:space="preserve">La central ve los rondines por sitio, punto, guardia y fecha, resaltando los que traen novedad o quedaron fuera de rango. Cada lectura tiene su ficha de detalle.</w:t>
+        <w:t xml:space="preserve">los checkpoints de un sitio que el guardia visita en sus rondas; cada uno tiene un código único que se materializa como QR.</w:t>
+      </w:r>
+    </w:p>
+    <w:p>
+      <w:pPr>
+        <w:spacing w:after="120" w:line="276"/>
+      </w:pPr>
+      <w:r>
+        <w:rPr>
+          <w:b/>
+          <w:bCs/>
+          <w:color w:val="222222"/>
+          <w:sz w:val="21"/>
+          <w:szCs w:val="21"/>
+        </w:rPr>
+        <w:t xml:space="preserve">Flujo:</w:t>
+      </w:r>
+    </w:p>
+    <w:p>
+      <w:pPr>
+        <w:pStyle w:val="ListParagraph"/>
+        <w:numPr>
+          <w:ilvl w:val="0"/>
+          <w:numId w:val="4"/>
+        </w:numPr>
+        <w:spacing w:after="70" w:line="268"/>
+      </w:pPr>
+      <w:r>
+        <w:rPr>
+          <w:color w:val="222222"/>
+          <w:sz w:val="21"/>
+          <w:szCs w:val="21"/>
+        </w:rPr>
+        <w:t xml:space="preserve">Se crea el punto eligiendo el sitio; el sistema propone un código único (también sirve para tag NFC), con orden y descripción.</w:t>
+      </w:r>
+    </w:p>
+    <w:p>
+      <w:pPr>
+        <w:pStyle w:val="ListParagraph"/>
+        <w:numPr>
+          <w:ilvl w:val="0"/>
+          <w:numId w:val="4"/>
+        </w:numPr>
+        <w:spacing w:after="70" w:line="268"/>
+      </w:pPr>
+      <w:r>
+        <w:rPr>
+          <w:color w:val="222222"/>
+          <w:sz w:val="21"/>
+          <w:szCs w:val="21"/>
+        </w:rPr>
+        <w:t xml:space="preserve">Desde la ficha del punto se ve su código QR y se puede imprimir: uno, todos los del sitio o todos los puntos, en una hoja de etiquetas (sitio, punto y código).</w:t>
+      </w:r>
+    </w:p>
+    <w:p>
+      <w:pPr>
+        <w:pStyle w:val="ListParagraph"/>
+        <w:numPr>
+          <w:ilvl w:val="0"/>
+          <w:numId w:val="4"/>
+        </w:numPr>
+        <w:spacing w:after="70" w:line="268"/>
+      </w:pPr>
+      <w:r>
+        <w:rPr>
+          <w:color w:val="222222"/>
+          <w:sz w:val="21"/>
+          <w:szCs w:val="21"/>
+        </w:rPr>
+        <w:t xml:space="preserve">El QR impreso se coloca físicamente en el punto; su contenido es lo que valida el sistema al escanearlo desde el móvil.</w:t>
       </w:r>
     </w:p>
     <w:p>
@@ -1677,7 +1804,7 @@
           <w:bCs/>
           <w:color w:val="1F3A5F"/>
         </w:rPr>
-        <w:t xml:space="preserve">4.6 Supervisión de rondín</w:t>
+        <w:t xml:space="preserve">4.6 Rondines (verificados con QR/NFC y geocerca)</w:t>
       </w:r>
     </w:p>
     <w:p>
@@ -1700,79 +1827,89 @@
           <w:sz w:val="21"/>
           <w:szCs w:val="21"/>
         </w:rPr>
-        <w:t xml:space="preserve">revisar a detalle el trabajo realizado, por fecha, cliente, sitio y guardia.</w:t>
-      </w:r>
-    </w:p>
-    <w:p>
-      <w:pPr>
-        <w:pStyle w:val="ListParagraph"/>
-        <w:numPr>
-          <w:ilvl w:val="0"/>
-          <w:numId w:val="2"/>
-        </w:numPr>
-        <w:spacing w:after="60" w:line="268"/>
-      </w:pPr>
-      <w:r>
-        <w:rPr>
-          <w:color w:val="222222"/>
-          <w:sz w:val="21"/>
-          <w:szCs w:val="21"/>
-        </w:rPr>
-        <w:t xml:space="preserve">Filtros en cascada fijos en pantalla: fecha (calendario) → cliente → sitio → guardia (opcional). Se pueden cambiar en cualquier momento; los resultados se desplazan con scroll debajo.</w:t>
-      </w:r>
-    </w:p>
-    <w:p>
-      <w:pPr>
-        <w:pStyle w:val="ListParagraph"/>
-        <w:numPr>
-          <w:ilvl w:val="0"/>
-          <w:numId w:val="2"/>
-        </w:numPr>
-        <w:spacing w:after="60" w:line="268"/>
-      </w:pPr>
-      <w:r>
-        <w:rPr>
-          <w:color w:val="222222"/>
-          <w:sz w:val="21"/>
-          <w:szCs w:val="21"/>
-        </w:rPr>
-        <w:t xml:space="preserve">Mapa con el trayecto GPS (línea) y el punto de lectura de cada QR/NFC (marcadores por guardia; rojo si hubo novedad o quedó fuera de rango). Al hacer clic en un punto se abre su registro.</w:t>
-      </w:r>
-    </w:p>
-    <w:p>
-      <w:pPr>
-        <w:pStyle w:val="ListParagraph"/>
-        <w:numPr>
-          <w:ilvl w:val="0"/>
-          <w:numId w:val="2"/>
-        </w:numPr>
-        <w:spacing w:after="60" w:line="268"/>
-      </w:pPr>
-      <w:r>
-        <w:rPr>
-          <w:color w:val="222222"/>
-          <w:sz w:val="21"/>
-          <w:szCs w:val="21"/>
-        </w:rPr>
-        <w:t xml:space="preserve">Historial del recorrido agrupado por sitio y por guardia, colapsable: al abrir un guardia se ve su línea de tiempo (punto, fecha/hora, método y novedades).</w:t>
-      </w:r>
-    </w:p>
-    <w:p>
-      <w:pPr>
-        <w:pStyle w:val="ListParagraph"/>
-        <w:numPr>
-          <w:ilvl w:val="0"/>
-          <w:numId w:val="2"/>
-        </w:numPr>
-        <w:spacing w:after="60" w:line="268"/>
-      </w:pPr>
-      <w:r>
-        <w:rPr>
-          <w:color w:val="222222"/>
-          <w:sz w:val="21"/>
-          <w:szCs w:val="21"/>
-        </w:rPr>
-        <w:t xml:space="preserve">Exportación a PDF por guardia (con su trayecto) o por sitio (todos los guardias, agrupados) para archivo o entrega al cliente.</w:t>
+        <w:t xml:space="preserve">la evidencia de que el guardia recorrió realmente los puntos de control.</w:t>
+      </w:r>
+    </w:p>
+    <w:p>
+      <w:pPr>
+        <w:pStyle w:val="ListParagraph"/>
+        <w:numPr>
+          <w:ilvl w:val="0"/>
+          <w:numId w:val="2"/>
+        </w:numPr>
+        <w:spacing w:after="60" w:line="268"/>
+      </w:pPr>
+      <w:r>
+        <w:rPr>
+          <w:color w:val="222222"/>
+          <w:sz w:val="21"/>
+          <w:szCs w:val="21"/>
+        </w:rPr>
+        <w:t xml:space="preserve">Cada paso proviene del campo: el guardia lee el punto por QR o por etiqueta NFC; el móvil registra guardia, hora, GPS y novedad.</w:t>
+      </w:r>
+    </w:p>
+    <w:p>
+      <w:pPr>
+        <w:pStyle w:val="ListParagraph"/>
+        <w:numPr>
+          <w:ilvl w:val="0"/>
+          <w:numId w:val="2"/>
+        </w:numPr>
+        <w:spacing w:after="60" w:line="268"/>
+      </w:pPr>
+      <w:r>
+        <w:rPr>
+          <w:b/>
+          <w:bCs/>
+          <w:color w:val="222222"/>
+          <w:sz w:val="21"/>
+          <w:szCs w:val="21"/>
+        </w:rPr>
+        <w:t xml:space="preserve">Validación de lugar (geocerca): </w:t>
+      </w:r>
+      <w:r>
+        <w:rPr>
+          <w:color w:val="222222"/>
+          <w:sz w:val="21"/>
+          <w:szCs w:val="21"/>
+        </w:rPr>
+        <w:t xml:space="preserve">el sistema calcula la distancia entre el guardia y la etiqueta y verifica que esté dentro del radio del punto más un margen de tolerancia por GPS. Si está fuera, el paso se registra pero queda marcado como “fuera de rango”.</w:t>
+      </w:r>
+    </w:p>
+    <w:p>
+      <w:pPr>
+        <w:pStyle w:val="ListParagraph"/>
+        <w:numPr>
+          <w:ilvl w:val="0"/>
+          <w:numId w:val="2"/>
+        </w:numPr>
+        <w:spacing w:after="60" w:line="268"/>
+      </w:pPr>
+      <w:r>
+        <w:rPr>
+          <w:color w:val="222222"/>
+          <w:sz w:val="21"/>
+          <w:szCs w:val="21"/>
+        </w:rPr>
+        <w:t xml:space="preserve">Cada lectura guarda además el método (QR/NFC), el tipo de evento (entrada/salida/control) y la distancia a la etiqueta.</w:t>
+      </w:r>
+    </w:p>
+    <w:p>
+      <w:pPr>
+        <w:pStyle w:val="ListParagraph"/>
+        <w:numPr>
+          <w:ilvl w:val="0"/>
+          <w:numId w:val="2"/>
+        </w:numPr>
+        <w:spacing w:after="60" w:line="268"/>
+      </w:pPr>
+      <w:r>
+        <w:rPr>
+          <w:color w:val="222222"/>
+          <w:sz w:val="21"/>
+          <w:szCs w:val="21"/>
+        </w:rPr>
+        <w:t xml:space="preserve">La central ve los rondines por sitio, punto, guardia y fecha, resaltando los que traen novedad o quedaron fuera de rango. Cada lectura tiene su ficha de detalle.</w:t>
       </w:r>
     </w:p>
     <w:p>
@@ -1786,7 +1923,7 @@
           <w:bCs/>
           <w:color w:val="1F3A5F"/>
         </w:rPr>
-        <w:t xml:space="preserve">4.7 Rol de turnos</w:t>
+        <w:t xml:space="preserve">4.7 Supervisión de rondín</w:t>
       </w:r>
     </w:p>
     <w:p>
@@ -1809,76 +1946,79 @@
           <w:sz w:val="21"/>
           <w:szCs w:val="21"/>
         </w:rPr>
-        <w:t xml:space="preserve">planificar quién cubre y supervisa cada jornada.</w:t>
-      </w:r>
-    </w:p>
-    <w:p>
-      <w:pPr>
-        <w:spacing w:after="120" w:line="276"/>
-      </w:pPr>
-      <w:r>
-        <w:rPr>
-          <w:b/>
-          <w:bCs/>
-          <w:color w:val="222222"/>
-          <w:sz w:val="21"/>
-          <w:szCs w:val="21"/>
-        </w:rPr>
-        <w:t xml:space="preserve">Flujo:</w:t>
-      </w:r>
-    </w:p>
-    <w:p>
-      <w:pPr>
-        <w:pStyle w:val="ListParagraph"/>
-        <w:numPr>
-          <w:ilvl w:val="0"/>
-          <w:numId w:val="5"/>
-        </w:numPr>
-        <w:spacing w:after="70" w:line="268"/>
-      </w:pPr>
-      <w:r>
-        <w:rPr>
-          <w:color w:val="222222"/>
-          <w:sz w:val="21"/>
-          <w:szCs w:val="21"/>
-        </w:rPr>
-        <w:t xml:space="preserve">Se crea el turno indicando su supervisor y la fecha (y tipo/horario); nace como borrador.</w:t>
-      </w:r>
-    </w:p>
-    <w:p>
-      <w:pPr>
-        <w:pStyle w:val="ListParagraph"/>
-        <w:numPr>
-          <w:ilvl w:val="0"/>
-          <w:numId w:val="5"/>
-        </w:numPr>
-        <w:spacing w:after="70" w:line="268"/>
-      </w:pPr>
-      <w:r>
-        <w:rPr>
-          <w:color w:val="222222"/>
-          <w:sz w:val="21"/>
-          <w:szCs w:val="21"/>
-        </w:rPr>
-        <w:t xml:space="preserve">Se abre el turno y se agregan los guardias marcando una casilla por cada uno; a cada guardia se le asigna su sitio/puesto.</w:t>
-      </w:r>
-    </w:p>
-    <w:p>
-      <w:pPr>
-        <w:pStyle w:val="ListParagraph"/>
-        <w:numPr>
-          <w:ilvl w:val="0"/>
-          <w:numId w:val="5"/>
-        </w:numPr>
-        <w:spacing w:after="70" w:line="268"/>
-      </w:pPr>
-      <w:r>
-        <w:rPr>
-          <w:color w:val="222222"/>
-          <w:sz w:val="21"/>
-          <w:szCs w:val="21"/>
-        </w:rPr>
-        <w:t xml:space="preserve">Se guarda y se activa (borrador → activo). Un turno anterior puede copiarse a una nueva fecha para editarlo y activarlo.</w:t>
+        <w:t xml:space="preserve">revisar a detalle el trabajo realizado, por fecha, cliente, sitio y guardia.</w:t>
+      </w:r>
+    </w:p>
+    <w:p>
+      <w:pPr>
+        <w:pStyle w:val="ListParagraph"/>
+        <w:numPr>
+          <w:ilvl w:val="0"/>
+          <w:numId w:val="2"/>
+        </w:numPr>
+        <w:spacing w:after="60" w:line="268"/>
+      </w:pPr>
+      <w:r>
+        <w:rPr>
+          <w:color w:val="222222"/>
+          <w:sz w:val="21"/>
+          <w:szCs w:val="21"/>
+        </w:rPr>
+        <w:t xml:space="preserve">Filtros en cascada fijos en pantalla: fecha (calendario) → cliente → sitio → guardia (opcional). Se pueden cambiar en cualquier momento; los resultados se desplazan con scroll debajo.</w:t>
+      </w:r>
+    </w:p>
+    <w:p>
+      <w:pPr>
+        <w:pStyle w:val="ListParagraph"/>
+        <w:numPr>
+          <w:ilvl w:val="0"/>
+          <w:numId w:val="2"/>
+        </w:numPr>
+        <w:spacing w:after="60" w:line="268"/>
+      </w:pPr>
+      <w:r>
+        <w:rPr>
+          <w:color w:val="222222"/>
+          <w:sz w:val="21"/>
+          <w:szCs w:val="21"/>
+        </w:rPr>
+        <w:t xml:space="preserve">Mapa con el trayecto GPS (línea) y el punto de lectura de cada QR/NFC (marcadores por guardia; rojo si hubo novedad o quedó fuera de rango). Al hacer clic en un punto se abre su registro.</w:t>
+      </w:r>
+    </w:p>
+    <w:p>
+      <w:pPr>
+        <w:pStyle w:val="ListParagraph"/>
+        <w:numPr>
+          <w:ilvl w:val="0"/>
+          <w:numId w:val="2"/>
+        </w:numPr>
+        <w:spacing w:after="60" w:line="268"/>
+      </w:pPr>
+      <w:r>
+        <w:rPr>
+          <w:color w:val="222222"/>
+          <w:sz w:val="21"/>
+          <w:szCs w:val="21"/>
+        </w:rPr>
+        <w:t xml:space="preserve">Historial del recorrido agrupado por sitio y por guardia, colapsable: al abrir un guardia se ve su línea de tiempo (punto, fecha/hora, método y novedades).</w:t>
+      </w:r>
+    </w:p>
+    <w:p>
+      <w:pPr>
+        <w:pStyle w:val="ListParagraph"/>
+        <w:numPr>
+          <w:ilvl w:val="0"/>
+          <w:numId w:val="2"/>
+        </w:numPr>
+        <w:spacing w:after="60" w:line="268"/>
+      </w:pPr>
+      <w:r>
+        <w:rPr>
+          <w:color w:val="222222"/>
+          <w:sz w:val="21"/>
+          <w:szCs w:val="21"/>
+        </w:rPr>
+        <w:t xml:space="preserve">Exportación a PDF por guardia (con su trayecto) o por sitio (todos los guardias, agrupados) para archivo o entrega al cliente.</w:t>
       </w:r>
     </w:p>
     <w:p>
@@ -1892,7 +2032,7 @@
           <w:bCs/>
           <w:color w:val="1F3A5F"/>
         </w:rPr>
-        <w:t xml:space="preserve">4.8 Tareas</w:t>
+        <w:t xml:space="preserve">4.8 Rol de turnos</w:t>
       </w:r>
     </w:p>
     <w:p>
@@ -1915,43 +2055,76 @@
           <w:sz w:val="21"/>
           <w:szCs w:val="21"/>
         </w:rPr>
-        <w:t xml:space="preserve">girar instrucciones a los guardias y darles seguimiento.</w:t>
-      </w:r>
-    </w:p>
-    <w:p>
-      <w:pPr>
-        <w:pStyle w:val="ListParagraph"/>
-        <w:numPr>
-          <w:ilvl w:val="0"/>
-          <w:numId w:val="2"/>
-        </w:numPr>
-        <w:spacing w:after="60" w:line="268"/>
-      </w:pPr>
-      <w:r>
-        <w:rPr>
-          <w:color w:val="222222"/>
-          <w:sz w:val="21"/>
-          <w:szCs w:val="21"/>
-        </w:rPr>
-        <w:t xml:space="preserve">Se crea con tipo, asunto, instrucciones, prioridad, vigencia y, si aplica, ubicación y fotos; se asigna a todos o a guardias específicos.</w:t>
-      </w:r>
-    </w:p>
-    <w:p>
-      <w:pPr>
-        <w:pStyle w:val="ListParagraph"/>
-        <w:numPr>
-          <w:ilvl w:val="0"/>
-          <w:numId w:val="2"/>
-        </w:numPr>
-        <w:spacing w:after="60" w:line="268"/>
-      </w:pPr>
-      <w:r>
-        <w:rPr>
-          <w:color w:val="222222"/>
-          <w:sz w:val="21"/>
-          <w:szCs w:val="21"/>
-        </w:rPr>
-        <w:t xml:space="preserve">Al asignarse dispara una notificación push al móvil; cada guardia responde (enterado, atendiendo, completada) y la central ve el avance.</w:t>
+        <w:t xml:space="preserve">planificar quién cubre y supervisa cada jornada.</w:t>
+      </w:r>
+    </w:p>
+    <w:p>
+      <w:pPr>
+        <w:spacing w:after="120" w:line="276"/>
+      </w:pPr>
+      <w:r>
+        <w:rPr>
+          <w:b/>
+          <w:bCs/>
+          <w:color w:val="222222"/>
+          <w:sz w:val="21"/>
+          <w:szCs w:val="21"/>
+        </w:rPr>
+        <w:t xml:space="preserve">Flujo:</w:t>
+      </w:r>
+    </w:p>
+    <w:p>
+      <w:pPr>
+        <w:pStyle w:val="ListParagraph"/>
+        <w:numPr>
+          <w:ilvl w:val="0"/>
+          <w:numId w:val="5"/>
+        </w:numPr>
+        <w:spacing w:after="70" w:line="268"/>
+      </w:pPr>
+      <w:r>
+        <w:rPr>
+          <w:color w:val="222222"/>
+          <w:sz w:val="21"/>
+          <w:szCs w:val="21"/>
+        </w:rPr>
+        <w:t xml:space="preserve">Se crea el turno indicando su supervisor y la fecha (y tipo/horario); nace como borrador.</w:t>
+      </w:r>
+    </w:p>
+    <w:p>
+      <w:pPr>
+        <w:pStyle w:val="ListParagraph"/>
+        <w:numPr>
+          <w:ilvl w:val="0"/>
+          <w:numId w:val="5"/>
+        </w:numPr>
+        <w:spacing w:after="70" w:line="268"/>
+      </w:pPr>
+      <w:r>
+        <w:rPr>
+          <w:color w:val="222222"/>
+          <w:sz w:val="21"/>
+          <w:szCs w:val="21"/>
+        </w:rPr>
+        <w:t xml:space="preserve">Se abre el turno y se agregan los guardias marcando una casilla por cada uno; a cada guardia se le asigna su sitio/puesto.</w:t>
+      </w:r>
+    </w:p>
+    <w:p>
+      <w:pPr>
+        <w:pStyle w:val="ListParagraph"/>
+        <w:numPr>
+          <w:ilvl w:val="0"/>
+          <w:numId w:val="5"/>
+        </w:numPr>
+        <w:spacing w:after="70" w:line="268"/>
+      </w:pPr>
+      <w:r>
+        <w:rPr>
+          <w:color w:val="222222"/>
+          <w:sz w:val="21"/>
+          <w:szCs w:val="21"/>
+        </w:rPr>
+        <w:t xml:space="preserve">Se guarda y se activa (borrador → activo). Un turno anterior puede copiarse a una nueva fecha para editarlo y activarlo.</w:t>
       </w:r>
     </w:p>
     <w:p>
@@ -1965,7 +2138,80 @@
           <w:bCs/>
           <w:color w:val="1F3A5F"/>
         </w:rPr>
-        <w:t xml:space="preserve">4.9 Otros módulos</w:t>
+        <w:t xml:space="preserve">4.9 Tareas</w:t>
+      </w:r>
+    </w:p>
+    <w:p>
+      <w:pPr>
+        <w:spacing w:after="120" w:line="276"/>
+      </w:pPr>
+      <w:r>
+        <w:rPr>
+          <w:b/>
+          <w:bCs/>
+          <w:color w:val="222222"/>
+          <w:sz w:val="21"/>
+          <w:szCs w:val="21"/>
+        </w:rPr>
+        <w:t xml:space="preserve">Propósito: </w:t>
+      </w:r>
+      <w:r>
+        <w:rPr>
+          <w:color w:val="222222"/>
+          <w:sz w:val="21"/>
+          <w:szCs w:val="21"/>
+        </w:rPr>
+        <w:t xml:space="preserve">girar instrucciones a los guardias y darles seguimiento.</w:t>
+      </w:r>
+    </w:p>
+    <w:p>
+      <w:pPr>
+        <w:pStyle w:val="ListParagraph"/>
+        <w:numPr>
+          <w:ilvl w:val="0"/>
+          <w:numId w:val="2"/>
+        </w:numPr>
+        <w:spacing w:after="60" w:line="268"/>
+      </w:pPr>
+      <w:r>
+        <w:rPr>
+          <w:color w:val="222222"/>
+          <w:sz w:val="21"/>
+          <w:szCs w:val="21"/>
+        </w:rPr>
+        <w:t xml:space="preserve">Se crea con tipo, asunto, instrucciones, prioridad, vigencia y, si aplica, ubicación y fotos; se asigna a todos o a guardias específicos.</w:t>
+      </w:r>
+    </w:p>
+    <w:p>
+      <w:pPr>
+        <w:pStyle w:val="ListParagraph"/>
+        <w:numPr>
+          <w:ilvl w:val="0"/>
+          <w:numId w:val="2"/>
+        </w:numPr>
+        <w:spacing w:after="60" w:line="268"/>
+      </w:pPr>
+      <w:r>
+        <w:rPr>
+          <w:color w:val="222222"/>
+          <w:sz w:val="21"/>
+          <w:szCs w:val="21"/>
+        </w:rPr>
+        <w:t xml:space="preserve">Al asignarse dispara una notificación push al móvil; cada guardia responde (enterado, atendiendo, completada) y la central ve el avance.</w:t>
+      </w:r>
+    </w:p>
+    <w:p>
+      <w:pPr>
+        <w:pStyle w:val="Heading2"/>
+        <w:spacing w:after="100" w:before="240"/>
+      </w:pPr>
+      <w:r>
+        <w:rPr>
+          <w:b/>
+          <w:bCs/>
+          <w:color w:val="1F3A5F"/>
+        </w:rPr>
+        <w:t xml:space="preserve">4.10 Otros módulos</w:t>
       </w:r>
     </w:p>
     <w:tbl>
@@ -3517,7 +3763,7 @@
           <w:sz w:val="21"/>
           <w:szCs w:val="21"/>
         </w:rPr>
-        <w:t xml:space="preserve">Mapa con sitios, puntos de control, guardias (con su estatus) e incidencias/alertas, cada uno con color y puntero propios; refresco cada minuto sin perder el foco del operador.</w:t>
+        <w:t xml:space="preserve">Mapa con sitios, puntos de control, guardias (con su estatus), incidencias/alertas y cámaras de videovigilancia, cada uno con color y puntero propios; refresco cada minuto sin perder el foco del operador.</w:t>
       </w:r>
     </w:p>
     <w:p>
@@ -4444,7 +4690,7 @@
           <w:sz w:val="16"/>
           <w:szCs w:val="16"/>
         </w:rPr>
-        <w:t xml:space="preserve">SGS — Sistema de Gestión de Seguridad · Documento de flujo operativo funcional · v2.1</w:t>
+        <w:t xml:space="preserve">SGS — Sistema de Gestión de Seguridad · Documento de flujo operativo funcional · v2.2</w:t>
       </w:r>
     </w:p>
     <w:sectPr>

</xml_diff>

<commit_message>
SGS: seed de demo (2 dias) + docs comercial v1.2 y flujo v2.3
- supabase/seeds/demo_operacion_2dias.sql: datos de demostracion idempotentes
  (cliente + 2 sitios, guardias, turnos ayer/hoy, GPS recorrido + en vivo,
  rondines en/fuera de rango, incidencias por severidad con tiempos de respuesta,
  accesos personas/vehiculos + citas + credenciales, salidas de zona, camara
  manual y metas SLA). Alimenta dashboard, reportes SLA y todos los modulos.
- Propuesta comercial v1.2: Control de accesos (CEDIS) + Indice de Cumplimiento
  y SLA como capacidades/diferenciadores.
- Flujo operativo v2.3: secciones 4.11 Control de accesos y 4.12 Cumplimiento/SLA;
  dashboard de dos tableros; accesos rapidos moviles actualizados.

Co-Authored-By: Claude Opus 4.8 <noreply@anthropic.com>
</commit_message>
<xml_diff>
--- a/docs/venta/SGS-Flujo-Operativo.docx
+++ b/docs/venta/SGS-Flujo-Operativo.docx
@@ -114,7 +114,7 @@
           <w:sz w:val="20"/>
           <w:szCs w:val="20"/>
         </w:rPr>
-        <w:t xml:space="preserve">Versión 2.2 · Agosto 2026</w:t>
+        <w:t xml:space="preserve">Versión 2.3 · Agosto 2026</w:t>
       </w:r>
     </w:p>
     <w:p>
@@ -2370,7 +2370,7 @@
                 <w:sz w:val="20"/>
                 <w:szCs w:val="20"/>
               </w:rPr>
-              <w:t xml:space="preserve">Indicadores SGS (emergencias, rondines, tareas, evidencias, turnos, sitios), galerías recientes y mapa de emergencias/despachos abiertos.</w:t>
+              <w:t xml:space="preserve">Dos tableros: Central/Operación (situación en vivo + “lo que requiere atención ahora”, cobertura de puestos, incidentes por severidad, tiempo de respuesta) y Dirección/Cliente (Índice de Cumplimiento 0–100, KPIs, tendencias).</w:t>
             </w:r>
           </w:p>
         </w:tc>
@@ -2699,6 +2699,332 @@
       </w:tr>
     </w:tbl>
     <w:p>
+      <w:pPr>
+        <w:pStyle w:val="Heading2"/>
+        <w:spacing w:after="100" w:before="240"/>
+      </w:pPr>
+      <w:r>
+        <w:rPr>
+          <w:b/>
+          <w:bCs/>
+          <w:color w:val="1F3A5F"/>
+        </w:rPr>
+        <w:t xml:space="preserve">4.11 Control de accesos</w:t>
+      </w:r>
+    </w:p>
+    <w:p>
+      <w:pPr>
+        <w:spacing w:after="120" w:line="276"/>
+      </w:pPr>
+      <w:r>
+        <w:rPr>
+          <w:b/>
+          <w:bCs/>
+          <w:color w:val="222222"/>
+          <w:sz w:val="21"/>
+          <w:szCs w:val="21"/>
+        </w:rPr>
+        <w:t xml:space="preserve">Propósito: </w:t>
+      </w:r>
+      <w:r>
+        <w:rPr>
+          <w:color w:val="222222"/>
+          <w:sz w:val="21"/>
+          <w:szCs w:val="21"/>
+        </w:rPr>
+        <w:t xml:space="preserve">registrar, autorizar y auditar el ingreso/salida de personas y vehículos por las casetas de un sitio. Ideal para CEDIS (centros de distribución).</w:t>
+      </w:r>
+    </w:p>
+    <w:p>
+      <w:pPr>
+        <w:pStyle w:val="ListParagraph"/>
+        <w:numPr>
+          <w:ilvl w:val="0"/>
+          <w:numId w:val="2"/>
+        </w:numPr>
+        <w:spacing w:after="60" w:line="268"/>
+      </w:pPr>
+      <w:r>
+        <w:rPr>
+          <w:b/>
+          <w:bCs/>
+          <w:color w:val="222222"/>
+          <w:sz w:val="21"/>
+          <w:szCs w:val="21"/>
+        </w:rPr>
+        <w:t xml:space="preserve">Casetas y credenciales: </w:t>
+      </w:r>
+      <w:r>
+        <w:rPr>
+          <w:color w:val="222222"/>
+          <w:sz w:val="21"/>
+          <w:szCs w:val="21"/>
+        </w:rPr>
+        <w:t xml:space="preserve">la caseta es un punto de control del sitio; el guardia identifica a la persona por credencial (QR/NFC/código temporal) o registra al visitante, con foto e identificación.</w:t>
+      </w:r>
+    </w:p>
+    <w:p>
+      <w:pPr>
+        <w:pStyle w:val="ListParagraph"/>
+        <w:numPr>
+          <w:ilvl w:val="0"/>
+          <w:numId w:val="2"/>
+        </w:numPr>
+        <w:spacing w:after="60" w:line="268"/>
+      </w:pPr>
+      <w:r>
+        <w:rPr>
+          <w:b/>
+          <w:bCs/>
+          <w:color w:val="222222"/>
+          <w:sz w:val="21"/>
+          <w:szCs w:val="21"/>
+        </w:rPr>
+        <w:t xml:space="preserve">Personas: </w:t>
+      </w:r>
+      <w:r>
+        <w:rPr>
+          <w:color w:val="222222"/>
+          <w:sz w:val="21"/>
+          <w:szCs w:val="21"/>
+        </w:rPr>
+        <w:t xml:space="preserve">entrada/salida con motivo y tipo (visitante, proveedor, contratista…); el sistema sabe en todo momento quién está dentro.</w:t>
+      </w:r>
+    </w:p>
+    <w:p>
+      <w:pPr>
+        <w:pStyle w:val="ListParagraph"/>
+        <w:numPr>
+          <w:ilvl w:val="0"/>
+          <w:numId w:val="2"/>
+        </w:numPr>
+        <w:spacing w:after="60" w:line="268"/>
+      </w:pPr>
+      <w:r>
+        <w:rPr>
+          <w:b/>
+          <w:bCs/>
+          <w:color w:val="222222"/>
+          <w:sz w:val="21"/>
+          <w:szCs w:val="21"/>
+        </w:rPr>
+        <w:t xml:space="preserve">Vehículos y citas (CEDIS): </w:t>
+      </w:r>
+      <w:r>
+        <w:rPr>
+          <w:color w:val="222222"/>
+          <w:sz w:val="21"/>
+          <w:szCs w:val="21"/>
+        </w:rPr>
+        <w:t xml:space="preserve">agenda de camiones con transportista, operador, placa, operación y andén, y una máquina de estados (programada → en caseta → en andén → carga/descarga → salida); el acceso del camión se liga a su cita.</w:t>
+      </w:r>
+    </w:p>
+    <w:p>
+      <w:pPr>
+        <w:pStyle w:val="ListParagraph"/>
+        <w:numPr>
+          <w:ilvl w:val="0"/>
+          <w:numId w:val="2"/>
+        </w:numPr>
+        <w:spacing w:after="60" w:line="268"/>
+      </w:pPr>
+      <w:r>
+        <w:rPr>
+          <w:b/>
+          <w:bCs/>
+          <w:color w:val="222222"/>
+          <w:sz w:val="21"/>
+          <w:szCs w:val="21"/>
+        </w:rPr>
+        <w:t xml:space="preserve">Autorización de excepción: </w:t>
+      </w:r>
+      <w:r>
+        <w:rPr>
+          <w:color w:val="222222"/>
+          <w:sz w:val="21"/>
+          <w:szCs w:val="21"/>
+        </w:rPr>
+        <w:t xml:space="preserve">si algo no está programado, el guardia pide autorización al supervisor (por chat) y la decisión queda registrada. Un acceso rechazado o anómalo puede generar un incidente.</w:t>
+      </w:r>
+    </w:p>
+    <w:p>
+      <w:pPr>
+        <w:pStyle w:val="ListParagraph"/>
+        <w:numPr>
+          <w:ilvl w:val="0"/>
+          <w:numId w:val="2"/>
+        </w:numPr>
+        <w:spacing w:after="60" w:line="268"/>
+      </w:pPr>
+      <w:r>
+        <w:rPr>
+          <w:b/>
+          <w:bCs/>
+          <w:color w:val="222222"/>
+          <w:sz w:val="21"/>
+          <w:szCs w:val="21"/>
+        </w:rPr>
+        <w:t xml:space="preserve">Zonas internas: </w:t>
+      </w:r>
+      <w:r>
+        <w:rPr>
+          <w:color w:val="222222"/>
+          <w:sz w:val="21"/>
+          <w:szCs w:val="21"/>
+        </w:rPr>
+        <w:t xml:space="preserve">permisos por zona (almacén, andenes, valores…) con horario y vigencia por persona o credencial.</w:t>
+      </w:r>
+    </w:p>
+    <w:p>
+      <w:pPr>
+        <w:pStyle w:val="ListParagraph"/>
+        <w:numPr>
+          <w:ilvl w:val="0"/>
+          <w:numId w:val="2"/>
+        </w:numPr>
+        <w:spacing w:after="60" w:line="268"/>
+      </w:pPr>
+      <w:r>
+        <w:rPr>
+          <w:b/>
+          <w:bCs/>
+          <w:color w:val="222222"/>
+          <w:sz w:val="21"/>
+          <w:szCs w:val="21"/>
+        </w:rPr>
+        <w:t xml:space="preserve">Auditoría: </w:t>
+      </w:r>
+      <w:r>
+        <w:rPr>
+          <w:color w:val="222222"/>
+          <w:sz w:val="21"/>
+          <w:szCs w:val="21"/>
+        </w:rPr>
+        <w:t xml:space="preserve">toda la bitácora de accesos es exportable a PDF por sitio y periodo, con folio y trazabilidad.</w:t>
+      </w:r>
+    </w:p>
+    <w:p>
+      <w:pPr>
+        <w:pStyle w:val="Heading2"/>
+        <w:spacing w:after="100" w:before="240"/>
+      </w:pPr>
+      <w:r>
+        <w:rPr>
+          <w:b/>
+          <w:bCs/>
+          <w:color w:val="1F3A5F"/>
+        </w:rPr>
+        <w:t xml:space="preserve">4.12 Cumplimiento y SLA (para dirección y cliente)</w:t>
+      </w:r>
+    </w:p>
+    <w:p>
+      <w:pPr>
+        <w:spacing w:after="120" w:line="276"/>
+      </w:pPr>
+      <w:r>
+        <w:rPr>
+          <w:b/>
+          <w:bCs/>
+          <w:color w:val="222222"/>
+          <w:sz w:val="21"/>
+          <w:szCs w:val="21"/>
+        </w:rPr>
+        <w:t xml:space="preserve">Propósito: </w:t>
+      </w:r>
+      <w:r>
+        <w:rPr>
+          <w:color w:val="222222"/>
+          <w:sz w:val="21"/>
+          <w:szCs w:val="21"/>
+        </w:rPr>
+        <w:t xml:space="preserve">demostrar con datos que el servicio contratado se está prestando.</w:t>
+      </w:r>
+    </w:p>
+    <w:p>
+      <w:pPr>
+        <w:pStyle w:val="ListParagraph"/>
+        <w:numPr>
+          <w:ilvl w:val="0"/>
+          <w:numId w:val="2"/>
+        </w:numPr>
+        <w:spacing w:after="60" w:line="268"/>
+      </w:pPr>
+      <w:r>
+        <w:rPr>
+          <w:b/>
+          <w:bCs/>
+          <w:color w:val="222222"/>
+          <w:sz w:val="21"/>
+          <w:szCs w:val="21"/>
+        </w:rPr>
+        <w:t xml:space="preserve">Índice de Cumplimiento de Seguridad (0–100): </w:t>
+      </w:r>
+      <w:r>
+        <w:rPr>
+          <w:color w:val="222222"/>
+          <w:sz w:val="21"/>
+          <w:szCs w:val="21"/>
+        </w:rPr>
+        <w:t xml:space="preserve">una sola cifra que combina cobertura, rondines, tiempo de respuesta e incidentes críticos.</w:t>
+      </w:r>
+    </w:p>
+    <w:p>
+      <w:pPr>
+        <w:pStyle w:val="ListParagraph"/>
+        <w:numPr>
+          <w:ilvl w:val="0"/>
+          <w:numId w:val="2"/>
+        </w:numPr>
+        <w:spacing w:after="60" w:line="268"/>
+      </w:pPr>
+      <w:r>
+        <w:rPr>
+          <w:b/>
+          <w:bCs/>
+          <w:color w:val="222222"/>
+          <w:sz w:val="21"/>
+          <w:szCs w:val="21"/>
+        </w:rPr>
+        <w:t xml:space="preserve">SLA por cliente: </w:t>
+      </w:r>
+      <w:r>
+        <w:rPr>
+          <w:color w:val="222222"/>
+          <w:sz w:val="21"/>
+          <w:szCs w:val="21"/>
+        </w:rPr>
+        <w:t xml:space="preserve">se definen las metas (cobertura, rondines, tiempo de respuesta) y el sistema calcula el % de cumplimiento del periodo.</w:t>
+      </w:r>
+    </w:p>
+    <w:p>
+      <w:pPr>
+        <w:pStyle w:val="ListParagraph"/>
+        <w:numPr>
+          <w:ilvl w:val="0"/>
+          <w:numId w:val="2"/>
+        </w:numPr>
+        <w:spacing w:after="60" w:line="268"/>
+      </w:pPr>
+      <w:r>
+        <w:rPr>
+          <w:b/>
+          <w:bCs/>
+          <w:color w:val="222222"/>
+          <w:sz w:val="21"/>
+          <w:szCs w:val="21"/>
+        </w:rPr>
+        <w:t xml:space="preserve">Reporte mensual: </w:t>
+      </w:r>
+      <w:r>
+        <w:rPr>
+          <w:color w:val="222222"/>
+          <w:sz w:val="21"/>
+          <w:szCs w:val="21"/>
+        </w:rPr>
+        <w:t xml:space="preserve">un reporte por cliente y mes —con el índice, el SLA y los indicadores clave— listo para imprimir y entregar. Es la evidencia que ayuda a retener contratos.</w:t>
+      </w:r>
+    </w:p>
+    <w:p>
       <w:r>
         <w:br w:type="page"/>
       </w:r>
@@ -2804,7 +3130,7 @@
           <w:sz w:val="21"/>
           <w:szCs w:val="21"/>
         </w:rPr>
-        <w:t xml:space="preserve">Encabezado con logo, “SGS Móvil”, el turno y el estado en línea. Accesos rápidos: Registrar rondín, Levantar incidente, Nueva evidencia, Mis tareas, Descargar bodycam y Crear un recordatorio. Un botón rojo destacado: ENVIAR ALERTA.</w:t>
+        <w:t xml:space="preserve">Encabezado con logo, “SGS Móvil”, el turno y el estado en línea. Accesos rápidos: Registrar rondín, Levantar incidente, Mis incidentes, Control de acceso (caseta), Nueva evidencia, Mis tareas, Activar/Detener bodycam y Enviar alerta. Un botón rojo destacado: ENVIAR ALERTA.</w:t>
       </w:r>
     </w:p>
     <w:p>
@@ -4690,7 +5016,7 @@
           <w:sz w:val="16"/>
           <w:szCs w:val="16"/>
         </w:rPr>
-        <w:t xml:space="preserve">SGS — Sistema de Gestión de Seguridad · Documento de flujo operativo funcional · v2.2</w:t>
+        <w:t xml:space="preserve">SGS — Sistema de Gestión de Seguridad · Documento de flujo operativo funcional · v2.3</w:t>
       </w:r>
     </w:p>
     <w:sectPr>

</xml_diff>